<commit_message>
docs: update documentation and add python compression script
- Add `pdfs/compresor.py` to handle zipping files with a 4MB limit
- Update `Manual_Ejecucion_Scripts_Bash_Windows.docx` with new execution steps including Python scripts
- Update `README.md` to include a note about verifying the existence of `C:\tmp`
- Update `src/tests/compressPdfsThisV2.spec.ts` to use `C:\tmp` for temporary files
</commit_message>
<xml_diff>
--- a/Manual_Ejecucion_Scripts_Bash_Windows.docx
+++ b/Manual_Ejecucion_Scripts_Bash_Windows.docx
@@ -5,160 +5,200 @@
     <w:p>
       <w:pPr>
         <w:pStyle w:val="Ttulo1"/>
+        <w:rPr>
+          <w:u w:val="single"/>
+          <w:lang w:val="es-MX"/>
+        </w:rPr>
       </w:pPr>
       <w:r>
+        <w:rPr>
+          <w:lang w:val="es-MX"/>
+        </w:rPr>
         <w:t>Manual de Ejecución de Scripts Bash en Windows</w:t>
+      </w:r>
+      <w:r>
+        <w:rPr>
+          <w:lang w:val="es-MX"/>
+        </w:rPr>
+        <w:t xml:space="preserve"> – Compresión de PDFs</w:t>
       </w:r>
     </w:p>
     <w:p>
       <w:pPr>
         <w:pStyle w:val="Textoindependiente"/>
+        <w:rPr>
+          <w:lang w:val="es-MX"/>
+        </w:rPr>
       </w:pPr>
       <w:r>
+        <w:rPr>
+          <w:lang w:val="es-MX"/>
+        </w:rPr>
         <w:t xml:space="preserve">Este documento describe los pasos requeridos para ejecutar la suite de scripts Bash </w:t>
       </w:r>
       <w:r>
+        <w:rPr>
+          <w:lang w:val="es-MX"/>
+        </w:rPr>
         <w:t xml:space="preserve">y Playwright tests </w:t>
       </w:r>
-      <w:proofErr w:type="spellStart"/>
       <w:r>
-        <w:t>diseñada</w:t>
-      </w:r>
-      <w:proofErr w:type="spellEnd"/>
-      <w:r>
-        <w:t xml:space="preserve"> para un entorno Windows </w:t>
-      </w:r>
-      <w:proofErr w:type="spellStart"/>
-      <w:r>
-        <w:t>usando</w:t>
-      </w:r>
-      <w:proofErr w:type="spellEnd"/>
-      <w:r>
-        <w:t xml:space="preserve"> </w:t>
-      </w:r>
-      <w:proofErr w:type="spellStart"/>
-      <w:r>
-        <w:t>Git</w:t>
-      </w:r>
-      <w:proofErr w:type="spellEnd"/>
-      <w:r>
-        <w:t xml:space="preserve"> Bash</w:t>
+        <w:rPr>
+          <w:lang w:val="es-MX"/>
+        </w:rPr>
+        <w:t>diseñada para un entorno Windows usando Git Bash</w:t>
       </w:r>
       <w:r>
+        <w:rPr>
+          <w:lang w:val="es-MX"/>
+        </w:rPr>
         <w:t xml:space="preserve"> y Node.js</w:t>
       </w:r>
       <w:r>
-        <w:t xml:space="preserve">, las </w:t>
-      </w:r>
-      <w:proofErr w:type="spellStart"/>
-      <w:r>
-        <w:t>dependencias</w:t>
-      </w:r>
-      <w:proofErr w:type="spellEnd"/>
-      <w:r>
-        <w:t xml:space="preserve"> </w:t>
-      </w:r>
-      <w:proofErr w:type="spellStart"/>
-      <w:r>
-        <w:t>externas</w:t>
-      </w:r>
-      <w:proofErr w:type="spellEnd"/>
-      <w:r>
-        <w:t xml:space="preserve"> necesarias, el orden de ejecución recomendado y </w:t>
-      </w:r>
-      <w:r>
-        <w:t>los archivos de salida generados por cada script.</w:t>
+        <w:rPr>
+          <w:lang w:val="es-MX"/>
+        </w:rPr>
+        <w:t>, las dependencias externas necesarias, el orden de ejecución recomendado y los archivos de salida generados por cada script.</w:t>
       </w:r>
     </w:p>
     <w:p>
       <w:pPr>
         <w:pStyle w:val="Ttulo2"/>
+        <w:rPr>
+          <w:lang w:val="es-MX"/>
+        </w:rPr>
       </w:pPr>
       <w:r>
+        <w:rPr>
+          <w:lang w:val="es-MX"/>
+        </w:rPr>
         <w:t>1. Prerrequisitos e Instalación del Entorno</w:t>
       </w:r>
     </w:p>
     <w:p>
       <w:pPr>
         <w:pStyle w:val="Ttulo3"/>
+        <w:rPr>
+          <w:lang w:val="es-MX"/>
+        </w:rPr>
       </w:pPr>
       <w:r>
+        <w:rPr>
+          <w:lang w:val="es-MX"/>
+        </w:rPr>
         <w:t>1.1. Por qué Git Bash es necesario en Windows</w:t>
       </w:r>
     </w:p>
     <w:p>
       <w:pPr>
         <w:pStyle w:val="Textoindependiente"/>
+        <w:rPr>
+          <w:lang w:val="es-MX"/>
+        </w:rPr>
       </w:pPr>
       <w:r>
-        <w:t>Git Bash proporciona un entorno Bash compatible con los scripts entregados. Windows no incluye un shell Bash nativo,</w:t>
-      </w:r>
-      <w:r>
-        <w:t xml:space="preserve"> y los scripts dependen de comandos como find, redirecciones estándar, sintaxis de Bash y utilidades GNU que Git Bash aporta.</w:t>
+        <w:rPr>
+          <w:lang w:val="es-MX"/>
+        </w:rPr>
+        <w:t>Git Bash proporciona un entorno Bash compatible con los scripts entregados. Windows no incluye un shell Bash nativo, y los scripts dependen de comandos como find, redirecciones estándar, sintaxis de Bash y utilidades GNU que Git Bash aporta.</w:t>
       </w:r>
     </w:p>
     <w:p>
       <w:pPr>
         <w:pStyle w:val="Textoindependiente"/>
+        <w:rPr>
+          <w:lang w:val="es-MX"/>
+        </w:rPr>
       </w:pPr>
       <w:r>
+        <w:rPr>
+          <w:lang w:val="es-MX"/>
+        </w:rPr>
         <w:t>Pasos de instalación de Git Bash:</w:t>
       </w:r>
     </w:p>
     <w:p>
       <w:pPr>
         <w:pStyle w:val="Listaconnmeros"/>
+        <w:rPr>
+          <w:lang w:val="es-MX"/>
+        </w:rPr>
       </w:pPr>
       <w:r>
+        <w:rPr>
+          <w:lang w:val="es-MX"/>
+        </w:rPr>
         <w:t>Descargue Git para Windows desde https://gitforwindows.org</w:t>
       </w:r>
     </w:p>
     <w:p>
       <w:pPr>
         <w:pStyle w:val="Listaconnmeros"/>
+        <w:rPr>
+          <w:lang w:val="es-MX"/>
+        </w:rPr>
       </w:pPr>
       <w:r>
+        <w:rPr>
+          <w:lang w:val="es-MX"/>
+        </w:rPr>
         <w:t>Ejecute el instalador descargado.</w:t>
       </w:r>
     </w:p>
     <w:p>
       <w:pPr>
         <w:pStyle w:val="Listaconnmeros"/>
+        <w:rPr>
+          <w:lang w:val="es-MX"/>
+        </w:rPr>
       </w:pPr>
       <w:r>
-        <w:t>Dur</w:t>
-      </w:r>
-      <w:r>
-        <w:t>ante la instalación, habilite la opción de usar Git Bash como terminal predeterminada si lo desea.</w:t>
+        <w:rPr>
+          <w:lang w:val="es-MX"/>
+        </w:rPr>
+        <w:t>Durante la instalación, habilite la opción de usar Git Bash como terminal predeterminada si lo desea.</w:t>
       </w:r>
     </w:p>
     <w:p>
       <w:pPr>
         <w:pStyle w:val="Listaconnmeros"/>
+        <w:rPr>
+          <w:lang w:val="es-MX"/>
+        </w:rPr>
       </w:pPr>
       <w:r>
+        <w:rPr>
+          <w:lang w:val="es-MX"/>
+        </w:rPr>
         <w:t>Asegúrese de seleccionar “Git from the command line and also from 3rd-party software” para agregar Git Bash al PATH.</w:t>
       </w:r>
     </w:p>
     <w:p>
       <w:pPr>
         <w:pStyle w:val="Textoindependiente"/>
+        <w:rPr>
+          <w:lang w:val="es-MX"/>
+        </w:rPr>
       </w:pPr>
       <w:r>
-        <w:t xml:space="preserve">Finalice la instalación y abra Git Bash </w:t>
-      </w:r>
-      <w:r>
-        <w:t>para validar con:</w:t>
+        <w:rPr>
+          <w:lang w:val="es-MX"/>
+        </w:rPr>
+        <w:t>Finalice la instalación y abra Git Bash para validar con:</w:t>
       </w:r>
     </w:p>
     <w:p>
       <w:pPr>
         <w:pStyle w:val="Sinespaciado"/>
+        <w:rPr>
+          <w:lang w:val="es-MX"/>
+        </w:rPr>
       </w:pPr>
       <w:r>
         <w:rPr>
           <w:rFonts w:ascii="Consolas" w:eastAsia="Consolas" w:hAnsi="Consolas"/>
           <w:sz w:val="20"/>
+          <w:lang w:val="es-MX"/>
         </w:rPr>
         <w:t>bash --version</w:t>
       </w:r>
@@ -166,110 +206,182 @@
     <w:p>
       <w:pPr>
         <w:pStyle w:val="Ttulo3"/>
+        <w:rPr>
+          <w:lang w:val="es-MX"/>
+        </w:rPr>
       </w:pPr>
       <w:r>
+        <w:rPr>
+          <w:lang w:val="es-MX"/>
+        </w:rPr>
         <w:t>1.2. Dependencias externas requeridas</w:t>
       </w:r>
     </w:p>
     <w:p>
       <w:pPr>
         <w:pStyle w:val="Textoindependiente"/>
+        <w:rPr>
+          <w:lang w:val="es-MX"/>
+        </w:rPr>
       </w:pPr>
       <w:r>
+        <w:rPr>
+          <w:lang w:val="es-MX"/>
+        </w:rPr>
         <w:t>Los scripts utilizan las siguientes herramientas externas:</w:t>
       </w:r>
     </w:p>
     <w:p>
       <w:pPr>
         <w:pStyle w:val="Listaconvietas"/>
+        <w:rPr>
+          <w:lang w:val="es-MX"/>
+        </w:rPr>
       </w:pPr>
       <w:r>
+        <w:rPr>
+          <w:lang w:val="es-MX"/>
+        </w:rPr>
         <w:t>Ghostscript</w:t>
       </w:r>
     </w:p>
     <w:p>
       <w:pPr>
         <w:pStyle w:val="Listaconvietas"/>
+        <w:rPr>
+          <w:lang w:val="es-MX"/>
+        </w:rPr>
       </w:pPr>
       <w:r>
+        <w:rPr>
+          <w:lang w:val="es-MX"/>
+        </w:rPr>
         <w:t>ImageMagick</w:t>
       </w:r>
     </w:p>
     <w:p>
       <w:pPr>
         <w:pStyle w:val="Listaconvietas"/>
+        <w:rPr>
+          <w:lang w:val="es-MX"/>
+        </w:rPr>
       </w:pPr>
       <w:r>
+        <w:rPr>
+          <w:lang w:val="es-MX"/>
+        </w:rPr>
         <w:t>PowerShell (incluido en Windows)</w:t>
       </w:r>
     </w:p>
     <w:p>
       <w:pPr>
         <w:pStyle w:val="Ttulo4"/>
+        <w:rPr>
+          <w:lang w:val="es-MX"/>
+        </w:rPr>
       </w:pPr>
       <w:r>
+        <w:rPr>
+          <w:lang w:val="es-MX"/>
+        </w:rPr>
         <w:t>Ghostscript</w:t>
       </w:r>
     </w:p>
     <w:p>
       <w:pPr>
         <w:pStyle w:val="Textoindependiente"/>
+        <w:rPr>
+          <w:lang w:val="es-MX"/>
+        </w:rPr>
       </w:pPr>
       <w:r>
-        <w:t>Ghostscript es la herramienta utilizada por el script com</w:t>
-      </w:r>
-      <w:r>
-        <w:t>press_pdfs_this.sh para comprimir PDFs. En Windows, el script busca gswin64c o gswin32c en el PATH.</w:t>
+        <w:rPr>
+          <w:lang w:val="es-MX"/>
+        </w:rPr>
+        <w:t>Ghostscript es la herramienta utilizada por el script compress_pdfs_this.sh para comprimir PDFs. En Windows, el script busca gswin64c o gswin32c en el PATH.</w:t>
       </w:r>
     </w:p>
     <w:p>
       <w:pPr>
         <w:pStyle w:val="Listaconvietas"/>
+        <w:rPr>
+          <w:lang w:val="es-MX"/>
+        </w:rPr>
       </w:pPr>
       <w:r>
+        <w:rPr>
+          <w:lang w:val="es-MX"/>
+        </w:rPr>
         <w:t>Instalación de Ghostscript:</w:t>
       </w:r>
     </w:p>
     <w:p>
       <w:pPr>
         <w:pStyle w:val="Listaconnmeros"/>
+        <w:rPr>
+          <w:lang w:val="es-MX"/>
+        </w:rPr>
       </w:pPr>
       <w:r>
+        <w:rPr>
+          <w:lang w:val="es-MX"/>
+        </w:rPr>
         <w:t>Descargue Ghostscript para Windows desde https://www.ghostscript.com/download/gsdnld.html</w:t>
       </w:r>
     </w:p>
     <w:p>
       <w:pPr>
         <w:pStyle w:val="Listaconnmeros"/>
+        <w:rPr>
+          <w:lang w:val="es-MX"/>
+        </w:rPr>
       </w:pPr>
       <w:r>
-        <w:t>Ejecute el instalador y siga los pasos</w:t>
-      </w:r>
-      <w:r>
-        <w:t xml:space="preserve"> de instalación.</w:t>
+        <w:rPr>
+          <w:lang w:val="es-MX"/>
+        </w:rPr>
+        <w:t>Ejecute el instalador y siga los pasos de instalación.</w:t>
       </w:r>
     </w:p>
     <w:p>
       <w:pPr>
         <w:pStyle w:val="Listaconnmeros"/>
+        <w:rPr>
+          <w:lang w:val="es-MX"/>
+        </w:rPr>
       </w:pPr>
       <w:r>
+        <w:rPr>
+          <w:lang w:val="es-MX"/>
+        </w:rPr>
         <w:t>Seleccione la versión de 64 bits si su Windows es de 64 bits.</w:t>
       </w:r>
     </w:p>
     <w:p>
       <w:pPr>
         <w:pStyle w:val="Listaconnmeros"/>
+        <w:rPr>
+          <w:lang w:val="es-MX"/>
+        </w:rPr>
       </w:pPr>
       <w:r>
+        <w:rPr>
+          <w:lang w:val="es-MX"/>
+        </w:rPr>
         <w:t>Asegúrese de agregar Ghostscript al PATH del sistema o anote la ruta de instalación, por ejemplo C:\Program Files\gs\gs9.xx\bin.</w:t>
       </w:r>
     </w:p>
     <w:p>
       <w:pPr>
         <w:pStyle w:val="Textoindependiente"/>
+        <w:rPr>
+          <w:lang w:val="es-MX"/>
+        </w:rPr>
       </w:pPr>
       <w:r>
+        <w:rPr>
+          <w:lang w:val="es-MX"/>
+        </w:rPr>
         <w:lastRenderedPageBreak/>
         <w:t>Valide la instalación en Git Bash ejecutando:</w:t>
       </w:r>
@@ -277,86 +389,129 @@
     <w:p>
       <w:pPr>
         <w:pStyle w:val="Sinespaciado"/>
+        <w:rPr>
+          <w:lang w:val="es-MX"/>
+        </w:rPr>
       </w:pPr>
       <w:r>
         <w:rPr>
           <w:rFonts w:ascii="Consolas" w:eastAsia="Consolas" w:hAnsi="Consolas"/>
           <w:sz w:val="20"/>
-        </w:rPr>
-        <w:t>gs</w:t>
-      </w:r>
-      <w:r>
-        <w:rPr>
-          <w:rFonts w:ascii="Consolas" w:eastAsia="Consolas" w:hAnsi="Consolas"/>
-          <w:sz w:val="20"/>
-        </w:rPr>
-        <w:t>win64c --version</w:t>
+          <w:lang w:val="es-MX"/>
+        </w:rPr>
+        <w:t>gswin64c --version</w:t>
       </w:r>
     </w:p>
     <w:p>
       <w:pPr>
         <w:pStyle w:val="Ttulo4"/>
+        <w:rPr>
+          <w:lang w:val="es-MX"/>
+        </w:rPr>
       </w:pPr>
       <w:r>
+        <w:rPr>
+          <w:lang w:val="es-MX"/>
+        </w:rPr>
         <w:t>ImageMagick</w:t>
       </w:r>
     </w:p>
     <w:p>
       <w:pPr>
         <w:pStyle w:val="Textoindependiente"/>
+        <w:rPr>
+          <w:lang w:val="es-MX"/>
+        </w:rPr>
       </w:pPr>
       <w:r>
+        <w:rPr>
+          <w:lang w:val="es-MX"/>
+        </w:rPr>
         <w:t>ImageMagick convierte archivos JPG/JPEG/PNG a PDF mediante el script convert_images_to_pdfs_recursive_this.sh.</w:t>
       </w:r>
     </w:p>
     <w:p>
       <w:pPr>
         <w:pStyle w:val="Listaconvietas"/>
+        <w:rPr>
+          <w:lang w:val="es-MX"/>
+        </w:rPr>
       </w:pPr>
       <w:r>
+        <w:rPr>
+          <w:lang w:val="es-MX"/>
+        </w:rPr>
         <w:t>Instalación de ImageMagick:</w:t>
       </w:r>
     </w:p>
     <w:p>
       <w:pPr>
         <w:pStyle w:val="Listaconnmeros"/>
+        <w:rPr>
+          <w:lang w:val="es-MX"/>
+        </w:rPr>
       </w:pPr>
       <w:r>
+        <w:rPr>
+          <w:lang w:val="es-MX"/>
+        </w:rPr>
         <w:t>Descargue ImageMagick para Windows desde https://imagemagick.org/script/download.php</w:t>
       </w:r>
     </w:p>
     <w:p>
       <w:pPr>
         <w:pStyle w:val="Listaconnmeros"/>
+        <w:rPr>
+          <w:lang w:val="es-MX"/>
+        </w:rPr>
       </w:pPr>
       <w:r>
+        <w:rPr>
+          <w:lang w:val="es-MX"/>
+        </w:rPr>
         <w:t>Ejecute el instalador y habilite la opción “Install legacy utilities (e.g., convert)” si está disponible.</w:t>
       </w:r>
     </w:p>
     <w:p>
       <w:pPr>
         <w:pStyle w:val="Listaconnmeros"/>
+        <w:rPr>
+          <w:lang w:val="es-MX"/>
+        </w:rPr>
       </w:pPr>
       <w:r>
+        <w:rPr>
+          <w:lang w:val="es-MX"/>
+        </w:rPr>
         <w:t>Asegúrese de que “Add application directory to your system PATH” esté activado.</w:t>
       </w:r>
     </w:p>
     <w:p>
       <w:pPr>
         <w:pStyle w:val="Textoindependiente"/>
+        <w:rPr>
+          <w:lang w:val="es-MX"/>
+        </w:rPr>
       </w:pPr>
       <w:r>
+        <w:rPr>
+          <w:lang w:val="es-MX"/>
+        </w:rPr>
         <w:t>Valide la instalación en Git Bash ejecutando:</w:t>
       </w:r>
     </w:p>
     <w:p>
       <w:pPr>
         <w:pStyle w:val="Sinespaciado"/>
+        <w:rPr>
+          <w:lang w:val="es-MX"/>
+        </w:rPr>
       </w:pPr>
       <w:r>
         <w:rPr>
           <w:rFonts w:ascii="Consolas" w:eastAsia="Consolas" w:hAnsi="Consolas"/>
           <w:sz w:val="20"/>
+          <w:lang w:val="es-MX"/>
         </w:rPr>
         <w:t>magick --version</w:t>
       </w:r>
@@ -364,70 +519,79 @@
     <w:p>
       <w:pPr>
         <w:pStyle w:val="Ttulo4"/>
+        <w:rPr>
+          <w:lang w:val="es-MX"/>
+        </w:rPr>
       </w:pPr>
       <w:r>
-        <w:t>PowerSh</w:t>
-      </w:r>
-      <w:r>
-        <w:t>ell</w:t>
+        <w:rPr>
+          <w:lang w:val="es-MX"/>
+        </w:rPr>
+        <w:t>PowerShell</w:t>
       </w:r>
     </w:p>
     <w:p>
       <w:pPr>
         <w:pStyle w:val="Textoindependiente"/>
+        <w:rPr>
+          <w:lang w:val="es-MX"/>
+        </w:rPr>
       </w:pPr>
       <w:r>
+        <w:rPr>
+          <w:lang w:val="es-MX"/>
+        </w:rPr>
         <w:t>PowerShell es necesario solo para el script opcional unlock_files_recursive_this.sh. Este script usa el comando Unblock-File para desbloquear archivos descargados en Windows.</w:t>
       </w:r>
     </w:p>
     <w:p>
       <w:pPr>
         <w:pStyle w:val="Textoindependiente"/>
+        <w:rPr>
+          <w:lang w:val="es-MX"/>
+        </w:rPr>
       </w:pPr>
       <w:r>
-        <w:t xml:space="preserve">PowerShell viene instalado por defecto en Windows 10 y Windows 11. El script </w:t>
-      </w:r>
-      <w:r>
-        <w:t xml:space="preserve">invoca powershell.exe </w:t>
-      </w:r>
-      <w:proofErr w:type="spellStart"/>
-      <w:r>
-        <w:t>desde</w:t>
-      </w:r>
-      <w:proofErr w:type="spellEnd"/>
-      <w:r>
-        <w:t xml:space="preserve"> </w:t>
-      </w:r>
-      <w:proofErr w:type="spellStart"/>
-      <w:r>
-        <w:t>Git</w:t>
-      </w:r>
-      <w:proofErr w:type="spellEnd"/>
-      <w:r>
-        <w:t xml:space="preserve"> Bash.</w:t>
+        <w:rPr>
+          <w:lang w:val="es-MX"/>
+        </w:rPr>
+        <w:t>PowerShell viene instalado por defecto en Windows 10 y Windows 11. El script invoca powershell.exe desde Git Bash.</w:t>
       </w:r>
     </w:p>
     <w:p>
       <w:pPr>
         <w:pStyle w:val="Textoindependiente"/>
+        <w:rPr>
+          <w:lang w:val="es-MX"/>
+        </w:rPr>
       </w:pPr>
     </w:p>
     <w:p>
       <w:pPr>
         <w:pStyle w:val="Ttulo4"/>
+        <w:rPr>
+          <w:lang w:val="es-MX"/>
+        </w:rPr>
       </w:pPr>
       <w:r>
+        <w:rPr>
+          <w:lang w:val="es-MX"/>
+        </w:rPr>
         <w:t>Playwright</w:t>
       </w:r>
     </w:p>
     <w:p>
       <w:pPr>
         <w:pStyle w:val="Textoindependiente"/>
-      </w:pPr>
-      <w:hyperlink r:id="rId6" w:history="1">
+        <w:rPr>
+          <w:lang w:val="es-MX"/>
+        </w:rPr>
+      </w:pPr>
+      <w:hyperlink r:id="rId6" w:anchor="system-requirements" w:history="1">
         <w:r>
           <w:rPr>
             <w:rStyle w:val="Hipervnculo"/>
+            <w:lang w:val="es-MX"/>
           </w:rPr>
           <w:t>https://playwright.dev/docs/intro#system-requirements</w:t>
         </w:r>
@@ -436,92 +600,52 @@
     <w:p>
       <w:pPr>
         <w:pStyle w:val="Textoindependiente"/>
+        <w:rPr>
+          <w:lang w:val="es-MX"/>
+        </w:rPr>
       </w:pPr>
       <w:r>
+        <w:rPr>
+          <w:lang w:val="es-MX"/>
+        </w:rPr>
         <w:t>https://playwright.dev/docs/intro</w:t>
       </w:r>
     </w:p>
     <w:p>
       <w:pPr>
         <w:pStyle w:val="Textoindependiente"/>
+        <w:rPr>
+          <w:lang w:val="es-MX"/>
+        </w:rPr>
       </w:pPr>
     </w:p>
     <w:p>
       <w:pPr>
         <w:pStyle w:val="Ttulo2"/>
+        <w:rPr>
+          <w:lang w:val="es-MX"/>
+        </w:rPr>
       </w:pPr>
       <w:r>
+        <w:rPr>
+          <w:lang w:val="es-MX"/>
+        </w:rPr>
         <w:t>2. Flujo y Orden de Ejecución</w:t>
       </w:r>
     </w:p>
     <w:p>
       <w:pPr>
         <w:pStyle w:val="Textoindependiente"/>
+        <w:rPr>
+          <w:lang w:val="es-MX"/>
+        </w:rPr>
       </w:pPr>
       <w:r>
-        <w:t xml:space="preserve">Se recomienda ejecutar los scripts en el siguiente orden para preparar, comprimir y </w:t>
+        <w:rPr>
+          <w:lang w:val="es-MX"/>
+        </w:rPr>
+        <w:t>Se recomienda ejecutar los scripts en el siguiente orden para preparar, comprimir y auditar los resultados:</w:t>
       </w:r>
-      <w:proofErr w:type="spellStart"/>
-      <w:r>
-        <w:t>auditar</w:t>
-      </w:r>
-      <w:proofErr w:type="spellEnd"/>
-      <w:r>
-        <w:t xml:space="preserve"> </w:t>
-      </w:r>
-      <w:proofErr w:type="spellStart"/>
-      <w:r>
-        <w:t>los</w:t>
-      </w:r>
-      <w:proofErr w:type="spellEnd"/>
-      <w:r>
-        <w:t xml:space="preserve"> </w:t>
-      </w:r>
-      <w:proofErr w:type="spellStart"/>
-      <w:r>
-        <w:t>resultados</w:t>
-      </w:r>
-      <w:proofErr w:type="spellEnd"/>
-      <w:r>
-        <w:t>:</w:t>
-      </w:r>
-    </w:p>
-    <w:p>
-      <w:pPr>
-        <w:pStyle w:val="Listaconnmeros"/>
-      </w:pPr>
-      <w:r>
-        <w:t xml:space="preserve"># 1. </w:t>
-      </w:r>
-      <w:proofErr w:type="spellStart"/>
-      <w:r>
-        <w:t>Clonar</w:t>
-      </w:r>
-      <w:proofErr w:type="spellEnd"/>
-      <w:r>
-        <w:t xml:space="preserve"> o </w:t>
-      </w:r>
-      <w:proofErr w:type="spellStart"/>
-      <w:r>
-        <w:t>crear</w:t>
-      </w:r>
-      <w:proofErr w:type="spellEnd"/>
-      <w:r>
-        <w:t xml:space="preserve"> la </w:t>
-      </w:r>
-      <w:proofErr w:type="spellStart"/>
-      <w:r>
-        <w:t>carpeta</w:t>
-      </w:r>
-      <w:proofErr w:type="spellEnd"/>
-      <w:r>
-        <w:t xml:space="preserve"> del </w:t>
-      </w:r>
-      <w:proofErr w:type="spellStart"/>
-      <w:r>
-        <w:t>proyecto</w:t>
-      </w:r>
-      <w:proofErr w:type="spellEnd"/>
     </w:p>
     <w:p>
       <w:pPr>
@@ -531,30 +655,15 @@
           <w:numId w:val="0"/>
         </w:numPr>
         <w:ind w:left="360"/>
-      </w:pPr>
-      <w:proofErr w:type="spellStart"/>
+        <w:rPr>
+          <w:lang w:val="es-MX"/>
+        </w:rPr>
+      </w:pPr>
       <w:r>
-        <w:t>mkdir</w:t>
-      </w:r>
-      <w:proofErr w:type="spellEnd"/>
-      <w:r>
-        <w:t xml:space="preserve"> pdf-</w:t>
-      </w:r>
-      <w:proofErr w:type="spellStart"/>
-      <w:r>
-        <w:t>qr</w:t>
-      </w:r>
-      <w:proofErr w:type="spellEnd"/>
-      <w:r>
-        <w:t>-validator &amp;&amp; cd pdf-</w:t>
-      </w:r>
-      <w:proofErr w:type="spellStart"/>
-      <w:r>
-        <w:t>qr</w:t>
-      </w:r>
-      <w:proofErr w:type="spellEnd"/>
-      <w:r>
-        <w:t>-validator</w:t>
+        <w:rPr>
+          <w:lang w:val="es-MX"/>
+        </w:rPr>
+        <w:t># 1. Clonar o crear la carpeta del proyecto</w:t>
       </w:r>
     </w:p>
     <w:p>
@@ -565,7 +674,16 @@
           <w:numId w:val="0"/>
         </w:numPr>
         <w:ind w:left="360"/>
-      </w:pPr>
+        <w:rPr>
+          <w:lang w:val="es-MX"/>
+        </w:rPr>
+      </w:pPr>
+      <w:r>
+        <w:rPr>
+          <w:lang w:val="es-MX"/>
+        </w:rPr>
+        <w:t>mkdir pdf-qr-validator &amp;&amp; cd pdf-qr-validator</w:t>
+      </w:r>
     </w:p>
     <w:p>
       <w:pPr>
@@ -575,42 +693,10 @@
           <w:numId w:val="0"/>
         </w:numPr>
         <w:ind w:left="360"/>
-      </w:pPr>
-      <w:r>
-        <w:t xml:space="preserve"># 2. </w:t>
-      </w:r>
-      <w:proofErr w:type="spellStart"/>
-      <w:r>
-        <w:t>Copiar</w:t>
-      </w:r>
-      <w:proofErr w:type="spellEnd"/>
-      <w:r>
-        <w:t xml:space="preserve"> </w:t>
-      </w:r>
-      <w:proofErr w:type="spellStart"/>
-      <w:r>
-        <w:t>todos</w:t>
-      </w:r>
-      <w:proofErr w:type="spellEnd"/>
-      <w:r>
-        <w:t xml:space="preserve"> </w:t>
-      </w:r>
-      <w:proofErr w:type="spellStart"/>
-      <w:r>
-        <w:t>los</w:t>
-      </w:r>
-      <w:proofErr w:type="spellEnd"/>
-      <w:r>
-        <w:t xml:space="preserve"> </w:t>
-      </w:r>
-      <w:proofErr w:type="spellStart"/>
-      <w:r>
-        <w:t>archivos</w:t>
-      </w:r>
-      <w:proofErr w:type="spellEnd"/>
-      <w:r>
-        <w:t xml:space="preserve"> del Proyecto</w:t>
-      </w:r>
+        <w:rPr>
+          <w:lang w:val="es-MX"/>
+        </w:rPr>
+      </w:pPr>
     </w:p>
     <w:p>
       <w:pPr>
@@ -620,7 +706,16 @@
           <w:numId w:val="0"/>
         </w:numPr>
         <w:ind w:left="360"/>
-      </w:pPr>
+        <w:rPr>
+          <w:lang w:val="es-MX"/>
+        </w:rPr>
+      </w:pPr>
+      <w:r>
+        <w:rPr>
+          <w:lang w:val="es-MX"/>
+        </w:rPr>
+        <w:t># 2. Copiar todos los archivos del Proyecto</w:t>
+      </w:r>
     </w:p>
     <w:p>
       <w:pPr>
@@ -630,66 +725,9 @@
           <w:numId w:val="0"/>
         </w:numPr>
         <w:ind w:left="360"/>
-      </w:pPr>
-      <w:r>
-        <w:t xml:space="preserve"># 2.1 </w:t>
-      </w:r>
-      <w:proofErr w:type="spellStart"/>
-      <w:r>
-        <w:t>Coloca</w:t>
-      </w:r>
-      <w:proofErr w:type="spellEnd"/>
-      <w:r>
-        <w:t xml:space="preserve"> </w:t>
-      </w:r>
-      <w:proofErr w:type="spellStart"/>
-      <w:r>
-        <w:t>los</w:t>
-      </w:r>
-      <w:proofErr w:type="spellEnd"/>
-      <w:r>
-        <w:t xml:space="preserve"> </w:t>
-      </w:r>
-      <w:proofErr w:type="spellStart"/>
-      <w:r>
-        <w:t>archivos</w:t>
-      </w:r>
-      <w:proofErr w:type="spellEnd"/>
-      <w:r>
-        <w:t xml:space="preserve"> de </w:t>
-      </w:r>
-      <w:proofErr w:type="spellStart"/>
-      <w:r>
-        <w:t>contabilidad</w:t>
-      </w:r>
-      <w:proofErr w:type="spellEnd"/>
-      <w:r>
-        <w:t xml:space="preserve"> </w:t>
-      </w:r>
-      <w:proofErr w:type="spellStart"/>
-      <w:r>
-        <w:t>en</w:t>
-      </w:r>
-      <w:proofErr w:type="spellEnd"/>
-      <w:r>
-        <w:t xml:space="preserve"> la </w:t>
-      </w:r>
-      <w:proofErr w:type="spellStart"/>
-      <w:r>
-        <w:t>carpeta</w:t>
-      </w:r>
-      <w:proofErr w:type="spellEnd"/>
-      <w:r>
-        <w:t xml:space="preserve"> /pdfs</w:t>
-      </w:r>
-    </w:p>
-    <w:p>
-      <w:pPr>
-        <w:pStyle w:val="Listaconnmeros"/>
-        <w:numPr>
-          <w:ilvl w:val="0"/>
-          <w:numId w:val="0"/>
-        </w:numPr>
+        <w:rPr>
+          <w:lang w:val="es-MX"/>
+        </w:rPr>
       </w:pPr>
     </w:p>
     <w:p>
@@ -700,146 +738,28 @@
           <w:numId w:val="0"/>
         </w:numPr>
         <w:ind w:left="360"/>
-      </w:pPr>
-    </w:p>
-    <w:p>
-      <w:pPr>
-        <w:pStyle w:val="Listaconnmeros"/>
-      </w:pPr>
-      <w:proofErr w:type="spellStart"/>
+        <w:rPr>
+          <w:lang w:val="es-MX"/>
+        </w:rPr>
+      </w:pPr>
       <w:r>
-        <w:t>M</w:t>
-      </w:r>
-      <w:r>
-        <w:t>overte</w:t>
-      </w:r>
-      <w:proofErr w:type="spellEnd"/>
-      <w:r>
-        <w:t xml:space="preserve"> al </w:t>
-      </w:r>
-      <w:proofErr w:type="spellStart"/>
-      <w:proofErr w:type="gramStart"/>
-      <w:r>
-        <w:t>foder</w:t>
-      </w:r>
-      <w:proofErr w:type="spellEnd"/>
-      <w:r>
-        <w:t xml:space="preserve"> ./</w:t>
-      </w:r>
-      <w:proofErr w:type="gramEnd"/>
-      <w:r>
-        <w:t xml:space="preserve">pdfs. </w:t>
-      </w:r>
-      <w:proofErr w:type="spellStart"/>
-      <w:r>
-        <w:t>Abra</w:t>
-      </w:r>
-      <w:proofErr w:type="spellEnd"/>
-      <w:r>
-        <w:t xml:space="preserve"> </w:t>
-      </w:r>
-      <w:r>
-        <w:t xml:space="preserve">un </w:t>
-      </w:r>
-      <w:proofErr w:type="spellStart"/>
-      <w:r>
-        <w:t>Git</w:t>
-      </w:r>
-      <w:proofErr w:type="spellEnd"/>
-      <w:r>
-        <w:t xml:space="preserve"> Bash </w:t>
-      </w:r>
-      <w:r>
-        <w:t xml:space="preserve">y corer el script: </w:t>
-      </w:r>
-      <w:r>
-        <w:t>convert_images_to_pdfs_recursive_this.sh</w:t>
+        <w:rPr>
+          <w:lang w:val="es-MX"/>
+        </w:rPr>
+        <w:t># 2.1 Coloca los archivos de contabilidad en la carpeta /pdfs</w:t>
       </w:r>
     </w:p>
     <w:p>
       <w:pPr>
-        <w:pStyle w:val="Textoindependiente"/>
-        <w:ind w:firstLine="360"/>
-      </w:pPr>
-      <w:r>
-        <w:lastRenderedPageBreak/>
-        <w:t>(</w:t>
-      </w:r>
-      <w:proofErr w:type="spellStart"/>
-      <w:r>
-        <w:t>Asegúrese</w:t>
-      </w:r>
-      <w:proofErr w:type="spellEnd"/>
-      <w:r>
-        <w:t xml:space="preserve"> de que </w:t>
-      </w:r>
-      <w:proofErr w:type="spellStart"/>
-      <w:r>
-        <w:t>los</w:t>
-      </w:r>
-      <w:proofErr w:type="spellEnd"/>
-      <w:r>
-        <w:t xml:space="preserve"> scripts </w:t>
-      </w:r>
-      <w:proofErr w:type="spellStart"/>
-      <w:r>
-        <w:t>tengan</w:t>
-      </w:r>
-      <w:proofErr w:type="spellEnd"/>
-      <w:r>
-        <w:t xml:space="preserve"> </w:t>
-      </w:r>
-      <w:proofErr w:type="spellStart"/>
-      <w:r>
-        <w:t>permiso</w:t>
-      </w:r>
-      <w:proofErr w:type="spellEnd"/>
-      <w:r>
-        <w:t xml:space="preserve"> de </w:t>
-      </w:r>
-      <w:proofErr w:type="spellStart"/>
-      <w:r>
-        <w:t>ejecución</w:t>
-      </w:r>
-      <w:proofErr w:type="spellEnd"/>
-      <w:r>
-        <w:t>:</w:t>
-      </w:r>
-      <w:r>
-        <w:t xml:space="preserve"> </w:t>
-      </w:r>
-      <w:proofErr w:type="spellStart"/>
-      <w:r>
-        <w:rPr>
-          <w:rFonts w:ascii="Consolas" w:eastAsia="Consolas" w:hAnsi="Consolas"/>
-          <w:sz w:val="20"/>
-        </w:rPr>
-        <w:t>chmod</w:t>
-      </w:r>
-      <w:proofErr w:type="spellEnd"/>
-      <w:r>
-        <w:rPr>
-          <w:rFonts w:ascii="Consolas" w:eastAsia="Consolas" w:hAnsi="Consolas"/>
-          <w:sz w:val="20"/>
-        </w:rPr>
-        <w:t xml:space="preserve"> +x *.</w:t>
-      </w:r>
-      <w:proofErr w:type="spellStart"/>
-      <w:r>
-        <w:rPr>
-          <w:rFonts w:ascii="Consolas" w:eastAsia="Consolas" w:hAnsi="Consolas"/>
-          <w:sz w:val="20"/>
-        </w:rPr>
-        <w:t>sh</w:t>
-      </w:r>
-      <w:proofErr w:type="spellEnd"/>
-      <w:r>
-        <w:rPr>
-          <w:rFonts w:ascii="Consolas" w:eastAsia="Consolas" w:hAnsi="Consolas"/>
-          <w:sz w:val="20"/>
-        </w:rPr>
-        <w:t>)</w:t>
-      </w:r>
+        <w:pStyle w:val="Listaconnmeros"/>
+        <w:numPr>
+          <w:ilvl w:val="0"/>
+          <w:numId w:val="0"/>
+        </w:numPr>
+        <w:rPr>
+          <w:lang w:val="es-MX"/>
+        </w:rPr>
+      </w:pPr>
     </w:p>
     <w:p>
       <w:pPr>
@@ -849,28 +769,10 @@
           <w:numId w:val="0"/>
         </w:numPr>
         <w:ind w:left="360"/>
-      </w:pPr>
-    </w:p>
-    <w:p>
-      <w:pPr>
-        <w:pStyle w:val="Listaconnmeros"/>
-      </w:pPr>
-      <w:proofErr w:type="spellStart"/>
-      <w:r>
-        <w:t>Comprimir</w:t>
-      </w:r>
-      <w:proofErr w:type="spellEnd"/>
-      <w:r>
-        <w:t xml:space="preserve"> </w:t>
-      </w:r>
-      <w:proofErr w:type="spellStart"/>
-      <w:r>
-        <w:t>los</w:t>
-      </w:r>
-      <w:proofErr w:type="spellEnd"/>
-      <w:r>
-        <w:t xml:space="preserve"> pdf con el test de playwright</w:t>
-      </w:r>
+        <w:rPr>
+          <w:lang w:val="es-MX"/>
+        </w:rPr>
+      </w:pPr>
     </w:p>
     <w:p>
       <w:pPr>
@@ -880,7 +782,95 @@
           <w:numId w:val="0"/>
         </w:numPr>
         <w:ind w:left="360"/>
-      </w:pPr>
+        <w:rPr>
+          <w:lang w:val="es-MX"/>
+        </w:rPr>
+      </w:pPr>
+      <w:r>
+        <w:rPr>
+          <w:lang w:val="es-MX"/>
+        </w:rPr>
+        <w:t xml:space="preserve"># 3. </w:t>
+      </w:r>
+      <w:r>
+        <w:rPr>
+          <w:lang w:val="es-MX"/>
+        </w:rPr>
+        <w:t>M</w:t>
+      </w:r>
+      <w:r>
+        <w:rPr>
+          <w:lang w:val="es-MX"/>
+        </w:rPr>
+        <w:t xml:space="preserve">overte al </w:t>
+      </w:r>
+      <w:r>
+        <w:rPr>
+          <w:lang w:val="es-MX"/>
+        </w:rPr>
+        <w:t>folder</w:t>
+      </w:r>
+      <w:r>
+        <w:rPr>
+          <w:lang w:val="es-MX"/>
+        </w:rPr>
+        <w:t xml:space="preserve">  ./pdfs</w:t>
+      </w:r>
+      <w:r>
+        <w:rPr>
+          <w:lang w:val="es-MX"/>
+        </w:rPr>
+        <w:t xml:space="preserve"> Abra un Git Bash </w:t>
+      </w:r>
+      <w:r>
+        <w:rPr>
+          <w:lang w:val="es-MX"/>
+        </w:rPr>
+        <w:t xml:space="preserve">y </w:t>
+      </w:r>
+      <w:r>
+        <w:rPr>
+          <w:lang w:val="es-MX"/>
+        </w:rPr>
+        <w:t>correr</w:t>
+      </w:r>
+      <w:r>
+        <w:rPr>
+          <w:lang w:val="es-MX"/>
+        </w:rPr>
+        <w:t xml:space="preserve"> el script: </w:t>
+      </w:r>
+      <w:r>
+        <w:rPr>
+          <w:b/>
+          <w:lang w:val="es-MX"/>
+        </w:rPr>
+        <w:t>convert_images_to_pdfs_recursive_this.sh</w:t>
+      </w:r>
+    </w:p>
+    <w:p>
+      <w:pPr>
+        <w:pStyle w:val="Textoindependiente"/>
+        <w:ind w:firstLine="360"/>
+        <w:rPr>
+          <w:lang w:val="es-MX"/>
+        </w:rPr>
+      </w:pPr>
+      <w:r>
+        <w:rPr>
+          <w:lang w:val="es-MX"/>
+        </w:rPr>
+        <w:lastRenderedPageBreak/>
+        <w:t xml:space="preserve">(Asegúrese de que los scripts tengan permiso de ejecución: </w:t>
+      </w:r>
+      <w:r>
+        <w:rPr>
+          <w:rFonts w:ascii="Consolas" w:eastAsia="Consolas" w:hAnsi="Consolas"/>
+          <w:sz w:val="20"/>
+          <w:lang w:val="es-MX"/>
+        </w:rPr>
+        <w:t>chmod +x *.sh)</w:t>
+      </w:r>
     </w:p>
     <w:p>
       <w:pPr>
@@ -890,7 +880,36 @@
           <w:numId w:val="0"/>
         </w:numPr>
         <w:ind w:left="360"/>
-      </w:pPr>
+        <w:rPr>
+          <w:lang w:val="es-MX"/>
+        </w:rPr>
+      </w:pPr>
+    </w:p>
+    <w:p>
+      <w:pPr>
+        <w:pStyle w:val="Ttulo2"/>
+        <w:rPr>
+          <w:lang w:val="es-MX"/>
+        </w:rPr>
+      </w:pPr>
+      <w:r>
+        <w:rPr>
+          <w:lang w:val="es-MX"/>
+        </w:rPr>
+        <w:t xml:space="preserve">2.1 </w:t>
+      </w:r>
+      <w:r>
+        <w:rPr>
+          <w:lang w:val="es-MX"/>
+        </w:rPr>
+        <w:t xml:space="preserve">Comprimir los pdf con el test de </w:t>
+      </w:r>
+      <w:r>
+        <w:rPr>
+          <w:lang w:val="es-MX"/>
+        </w:rPr>
+        <w:t>Playwright</w:t>
+      </w:r>
     </w:p>
     <w:p>
       <w:pPr>
@@ -900,23 +919,10 @@
           <w:numId w:val="0"/>
         </w:numPr>
         <w:ind w:left="360"/>
-      </w:pPr>
-      <w:r>
-        <w:t xml:space="preserve"># 3. </w:t>
-      </w:r>
-      <w:proofErr w:type="spellStart"/>
-      <w:r>
-        <w:t>Instalar</w:t>
-      </w:r>
-      <w:proofErr w:type="spellEnd"/>
-      <w:r>
-        <w:t xml:space="preserve"> </w:t>
-      </w:r>
-      <w:proofErr w:type="spellStart"/>
-      <w:r>
-        <w:t>dependencias</w:t>
-      </w:r>
-      <w:proofErr w:type="spellEnd"/>
+        <w:rPr>
+          <w:lang w:val="es-MX"/>
+        </w:rPr>
+      </w:pPr>
     </w:p>
     <w:p>
       <w:pPr>
@@ -926,15 +932,10 @@
           <w:numId w:val="0"/>
         </w:numPr>
         <w:ind w:left="360"/>
-      </w:pPr>
-      <w:proofErr w:type="spellStart"/>
-      <w:r>
-        <w:t>npm</w:t>
-      </w:r>
-      <w:proofErr w:type="spellEnd"/>
-      <w:r>
-        <w:t xml:space="preserve"> install</w:t>
-      </w:r>
+        <w:rPr>
+          <w:lang w:val="es-MX"/>
+        </w:rPr>
+      </w:pPr>
     </w:p>
     <w:p>
       <w:pPr>
@@ -944,7 +945,16 @@
           <w:numId w:val="0"/>
         </w:numPr>
         <w:ind w:left="360"/>
-      </w:pPr>
+        <w:rPr>
+          <w:lang w:val="es-MX"/>
+        </w:rPr>
+      </w:pPr>
+      <w:r>
+        <w:rPr>
+          <w:lang w:val="es-MX"/>
+        </w:rPr>
+        <w:t># 3. Instalar dependencias</w:t>
+      </w:r>
     </w:p>
     <w:p>
       <w:pPr>
@@ -954,25 +964,15 @@
           <w:numId w:val="0"/>
         </w:numPr>
         <w:ind w:left="360"/>
+        <w:rPr>
+          <w:lang w:val="es-MX"/>
+        </w:rPr>
       </w:pPr>
       <w:r>
-        <w:t xml:space="preserve"># 4. </w:t>
-      </w:r>
-      <w:proofErr w:type="spellStart"/>
-      <w:r>
-        <w:t>Instalar</w:t>
-      </w:r>
-      <w:proofErr w:type="spellEnd"/>
-      <w:r>
-        <w:t xml:space="preserve"> </w:t>
-      </w:r>
-      <w:proofErr w:type="spellStart"/>
-      <w:r>
-        <w:t>navegadores</w:t>
-      </w:r>
-      <w:proofErr w:type="spellEnd"/>
-      <w:r>
-        <w:t xml:space="preserve"> de Playwright</w:t>
+        <w:rPr>
+          <w:lang w:val="es-MX"/>
+        </w:rPr>
+        <w:t>npm install</w:t>
       </w:r>
     </w:p>
     <w:p>
@@ -983,15 +983,10 @@
           <w:numId w:val="0"/>
         </w:numPr>
         <w:ind w:left="360"/>
-      </w:pPr>
-      <w:proofErr w:type="spellStart"/>
-      <w:r>
-        <w:t>npx</w:t>
-      </w:r>
-      <w:proofErr w:type="spellEnd"/>
-      <w:r>
-        <w:t xml:space="preserve"> playwright install</w:t>
-      </w:r>
+        <w:rPr>
+          <w:lang w:val="es-MX"/>
+        </w:rPr>
+      </w:pPr>
     </w:p>
     <w:p>
       <w:pPr>
@@ -1001,7 +996,16 @@
           <w:numId w:val="0"/>
         </w:numPr>
         <w:ind w:left="360"/>
-      </w:pPr>
+        <w:rPr>
+          <w:lang w:val="es-MX"/>
+        </w:rPr>
+      </w:pPr>
+      <w:r>
+        <w:rPr>
+          <w:lang w:val="es-MX"/>
+        </w:rPr>
+        <w:t># 4. Instalar navegadores de Playwright</w:t>
+      </w:r>
     </w:p>
     <w:p>
       <w:pPr>
@@ -1011,9 +1015,15 @@
           <w:numId w:val="0"/>
         </w:numPr>
         <w:ind w:left="360"/>
+        <w:rPr>
+          <w:lang w:val="es-MX"/>
+        </w:rPr>
       </w:pPr>
       <w:r>
-        <w:t># 5. Run the test</w:t>
+        <w:rPr>
+          <w:lang w:val="es-MX"/>
+        </w:rPr>
+        <w:t>npx playwright install</w:t>
       </w:r>
     </w:p>
     <w:p>
@@ -1024,28 +1034,10 @@
           <w:numId w:val="0"/>
         </w:numPr>
         <w:ind w:left="360"/>
-      </w:pPr>
-      <w:proofErr w:type="spellStart"/>
-      <w:r>
-        <w:t>npx</w:t>
-      </w:r>
-      <w:proofErr w:type="spellEnd"/>
-      <w:r>
-        <w:t xml:space="preserve"> playwright test </w:t>
-      </w:r>
-      <w:proofErr w:type="spellStart"/>
-      <w:r>
-        <w:t>src</w:t>
-      </w:r>
-      <w:proofErr w:type="spellEnd"/>
-      <w:r>
-        <w:t>/tests/</w:t>
-      </w:r>
-      <w:proofErr w:type="spellStart"/>
-      <w:r>
-        <w:t>compressPDFsThis.spec.ts</w:t>
-      </w:r>
-      <w:proofErr w:type="spellEnd"/>
+        <w:rPr>
+          <w:lang w:val="es-MX"/>
+        </w:rPr>
+      </w:pPr>
     </w:p>
     <w:p>
       <w:pPr>
@@ -1055,7 +1047,31 @@
           <w:numId w:val="0"/>
         </w:numPr>
         <w:ind w:left="360"/>
-      </w:pPr>
+        <w:rPr>
+          <w:u w:val="single"/>
+          <w:lang w:val="es-MX"/>
+        </w:rPr>
+      </w:pPr>
+      <w:r>
+        <w:rPr>
+          <w:lang w:val="es-MX"/>
+        </w:rPr>
+        <w:t xml:space="preserve"># 5. Run the </w:t>
+      </w:r>
+      <w:r>
+        <w:rPr>
+          <w:lang w:val="es-MX"/>
+        </w:rPr>
+        <w:t>PDFs</w:t>
+      </w:r>
+      <w:bookmarkStart w:id="0" w:name="_GoBack"/>
+      <w:bookmarkEnd w:id="0"/>
+      <w:r>
+        <w:rPr>
+          <w:lang w:val="es-MX"/>
+        </w:rPr>
+        <w:t xml:space="preserve"> compresión</w:t>
+      </w:r>
     </w:p>
     <w:p>
       <w:pPr>
@@ -1067,7 +1083,22 @@
         <w:ind w:left="360"/>
       </w:pPr>
       <w:r>
-        <w:t># 6. Check execution report:</w:t>
+        <w:t>npx playwright test src/tests/</w:t>
+      </w:r>
+      <w:r>
+        <w:rPr>
+          <w:b/>
+        </w:rPr>
+        <w:t>compressPDFsThis</w:t>
+      </w:r>
+      <w:r>
+        <w:rPr>
+          <w:b/>
+        </w:rPr>
+        <w:t>V2</w:t>
+      </w:r>
+      <w:r>
+        <w:t>.spec.ts</w:t>
       </w:r>
     </w:p>
     <w:p>
@@ -1079,14 +1110,6 @@
         </w:numPr>
         <w:ind w:left="360"/>
       </w:pPr>
-      <w:proofErr w:type="spellStart"/>
-      <w:r>
-        <w:t>npx</w:t>
-      </w:r>
-      <w:proofErr w:type="spellEnd"/>
-      <w:r>
-        <w:t xml:space="preserve"> playwright show-report</w:t>
-      </w:r>
     </w:p>
     <w:p>
       <w:pPr>
@@ -1096,225 +1119,567 @@
           <w:numId w:val="0"/>
         </w:numPr>
         <w:ind w:left="360"/>
-      </w:pPr>
-    </w:p>
-    <w:p>
-      <w:pPr>
-        <w:pStyle w:val="Listaconnmeros"/>
+        <w:rPr>
+          <w:lang w:val="es-MX"/>
+        </w:rPr>
       </w:pPr>
       <w:r>
-        <w:t>list_1M_PDF_large</w:t>
-      </w:r>
-      <w:r>
-        <w:t>_files_this.sh</w:t>
+        <w:rPr>
+          <w:lang w:val="es-MX"/>
+        </w:rPr>
+        <w:t># 6. Check execution report:</w:t>
       </w:r>
     </w:p>
     <w:p>
       <w:pPr>
         <w:pStyle w:val="Listaconnmeros"/>
-      </w:pPr>
+        <w:numPr>
+          <w:ilvl w:val="0"/>
+          <w:numId w:val="0"/>
+        </w:numPr>
+        <w:ind w:left="360"/>
+        <w:rPr>
+          <w:lang w:val="es-MX"/>
+        </w:rPr>
+      </w:pPr>
+      <w:r>
+        <w:rPr>
+          <w:lang w:val="es-MX"/>
+        </w:rPr>
+        <w:t>npx playwright show-report</w:t>
+      </w:r>
+    </w:p>
+    <w:p>
+      <w:pPr>
+        <w:pStyle w:val="Listaconnmeros"/>
+        <w:numPr>
+          <w:ilvl w:val="0"/>
+          <w:numId w:val="0"/>
+        </w:numPr>
+        <w:ind w:left="360"/>
+        <w:rPr>
+          <w:lang w:val="es-MX"/>
+        </w:rPr>
+      </w:pPr>
+    </w:p>
+    <w:p>
+      <w:pPr>
+        <w:pStyle w:val="Listaconnmeros"/>
+        <w:numPr>
+          <w:ilvl w:val="0"/>
+          <w:numId w:val="0"/>
+        </w:numPr>
+        <w:ind w:left="360"/>
+      </w:pPr>
+      <w:r>
+        <w:t xml:space="preserve"># </w:t>
+      </w:r>
+      <w:r>
+        <w:t xml:space="preserve">7. </w:t>
+      </w:r>
+      <w:r>
+        <w:t>list_1M_PDF_large_files_this.sh</w:t>
+      </w:r>
+    </w:p>
+    <w:p>
+      <w:pPr>
+        <w:pStyle w:val="Listaconnmeros"/>
+        <w:numPr>
+          <w:ilvl w:val="0"/>
+          <w:numId w:val="0"/>
+        </w:numPr>
+        <w:ind w:left="360"/>
+      </w:pPr>
+      <w:r>
+        <w:t xml:space="preserve"># 8. </w:t>
+      </w:r>
       <w:r>
         <w:t>list_4MB_large_files_this.sh</w:t>
       </w:r>
     </w:p>
     <w:p>
       <w:pPr>
+        <w:pStyle w:val="Listaconnmeros"/>
+        <w:numPr>
+          <w:ilvl w:val="0"/>
+          <w:numId w:val="0"/>
+        </w:numPr>
+        <w:ind w:left="360"/>
+        <w:rPr>
+          <w:lang w:val="es-MX"/>
+        </w:rPr>
+      </w:pPr>
+      <w:r>
+        <w:rPr>
+          <w:lang w:val="es-MX"/>
+        </w:rPr>
+        <w:t xml:space="preserve"># 9. Correr el archive de </w:t>
+      </w:r>
+      <w:r>
+        <w:rPr>
+          <w:lang w:val="es-MX"/>
+        </w:rPr>
+        <w:t xml:space="preserve">Python para dividir los pdf mayores a 4 MBs para que se puedan zippiar, </w:t>
+      </w:r>
+      <w:r>
+        <w:rPr>
+          <w:lang w:val="es-MX"/>
+        </w:rPr>
+        <w:t>DEFAULT_DIR = "/c/githubProjects/playwrightProjects/pdfValidator/pdfs"</w:t>
+      </w:r>
+      <w:r>
+        <w:rPr>
+          <w:lang w:val="es-MX"/>
+        </w:rPr>
+        <w:t>:</w:t>
+      </w:r>
+    </w:p>
+    <w:p>
+      <w:pPr>
+        <w:pStyle w:val="Listaconnmeros"/>
+        <w:numPr>
+          <w:ilvl w:val="0"/>
+          <w:numId w:val="0"/>
+        </w:numPr>
+        <w:ind w:left="360"/>
+        <w:rPr>
+          <w:lang w:val="es-MX"/>
+        </w:rPr>
+      </w:pPr>
+    </w:p>
+    <w:p>
+      <w:pPr>
+        <w:pStyle w:val="Listaconnmeros"/>
+        <w:numPr>
+          <w:ilvl w:val="0"/>
+          <w:numId w:val="0"/>
+        </w:numPr>
+        <w:ind w:left="360"/>
+      </w:pPr>
+      <w:r>
+        <w:t>“p</w:t>
+      </w:r>
+      <w:r>
+        <w:t>ython split_4M_PDF_python</w:t>
+      </w:r>
+      <w:r>
+        <w:t>.py”</w:t>
+      </w:r>
+    </w:p>
+    <w:p>
+      <w:pPr>
+        <w:pStyle w:val="Listaconnmeros"/>
+        <w:numPr>
+          <w:ilvl w:val="0"/>
+          <w:numId w:val="0"/>
+        </w:numPr>
+        <w:ind w:left="360"/>
+      </w:pPr>
+    </w:p>
+    <w:p>
+      <w:pPr>
+        <w:pStyle w:val="Listaconnmeros"/>
+        <w:numPr>
+          <w:ilvl w:val="0"/>
+          <w:numId w:val="0"/>
+        </w:numPr>
+        <w:ind w:left="360"/>
+        <w:rPr>
+          <w:lang w:val="es-MX"/>
+        </w:rPr>
+      </w:pPr>
+      <w:r>
+        <w:rPr>
+          <w:lang w:val="es-MX"/>
+        </w:rPr>
+        <w:t xml:space="preserve"># 10. Correr el Zippiador </w:t>
+      </w:r>
+      <w:r>
+        <w:rPr>
+          <w:lang w:val="es-MX"/>
+        </w:rPr>
+        <w:t xml:space="preserve">de Python </w:t>
+      </w:r>
+      <w:r>
+        <w:rPr>
+          <w:lang w:val="es-MX"/>
+        </w:rPr>
+        <w:t>con W</w:t>
+      </w:r>
+      <w:r>
+        <w:rPr>
+          <w:lang w:val="es-MX"/>
+        </w:rPr>
+        <w:t xml:space="preserve">inRAR, default </w:t>
+      </w:r>
+      <w:r>
+        <w:rPr>
+          <w:lang w:val="es-MX"/>
+        </w:rPr>
+        <w:t>--limite 4mb</w:t>
+      </w:r>
+      <w:r>
+        <w:rPr>
+          <w:lang w:val="es-MX"/>
+        </w:rPr>
+        <w:t xml:space="preserve"> de los ZIPs files:</w:t>
+      </w:r>
+    </w:p>
+    <w:p>
+      <w:pPr>
+        <w:pStyle w:val="Listaconnmeros"/>
+        <w:numPr>
+          <w:ilvl w:val="0"/>
+          <w:numId w:val="0"/>
+        </w:numPr>
+        <w:ind w:left="360"/>
+        <w:rPr>
+          <w:lang w:val="es-MX"/>
+        </w:rPr>
+      </w:pPr>
+      <w:r>
+        <w:rPr>
+          <w:lang w:val="es-MX"/>
+        </w:rPr>
+        <w:t xml:space="preserve">“python </w:t>
+      </w:r>
+      <w:r>
+        <w:rPr>
+          <w:lang w:val="es-MX"/>
+        </w:rPr>
+        <w:t>compresor.py</w:t>
+      </w:r>
+      <w:r>
+        <w:rPr>
+          <w:lang w:val="es-MX"/>
+        </w:rPr>
+        <w:t>”</w:t>
+      </w:r>
+    </w:p>
+    <w:p>
+      <w:pPr>
         <w:pStyle w:val="Ttulo2"/>
+        <w:rPr>
+          <w:lang w:val="es-MX"/>
+        </w:rPr>
       </w:pPr>
       <w:r>
+        <w:rPr>
+          <w:lang w:val="es-MX"/>
+        </w:rPr>
         <w:t>3. Scripts Opcionales</w:t>
       </w:r>
     </w:p>
     <w:p>
       <w:pPr>
         <w:pStyle w:val="Textoindependiente"/>
+        <w:rPr>
+          <w:lang w:val="es-MX"/>
+        </w:rPr>
       </w:pPr>
       <w:r>
-        <w:t>unlock_files_recursive_this.sh es un script</w:t>
+        <w:rPr>
+          <w:b/>
+          <w:lang w:val="es-MX"/>
+        </w:rPr>
+        <w:t>unlock_files_recursive_this.sh</w:t>
       </w:r>
       <w:r>
-        <w:t xml:space="preserve"> opcional que desbloquea archivos PDF descargados desde Internet. Úselo cuando Windows marque los archivos como bloqueados y no se puedan previsualizar o abrir correctamente en el Explorador de Windows.</w:t>
+        <w:rPr>
+          <w:lang w:val="es-MX"/>
+        </w:rPr>
+        <w:t xml:space="preserve"> es un script opcional que desbloquea archivos PDF descargados desde Internet. Úselo cuando Windows marque los archivos como bloqueados y no se puedan </w:t>
+      </w:r>
+      <w:r>
+        <w:rPr>
+          <w:lang w:val="es-MX"/>
+        </w:rPr>
+        <w:t>pre visualizar</w:t>
+      </w:r>
+      <w:r>
+        <w:rPr>
+          <w:lang w:val="es-MX"/>
+        </w:rPr>
+        <w:t xml:space="preserve"> o abrir correctamente en el Explorador de Windows.</w:t>
       </w:r>
     </w:p>
     <w:p>
       <w:pPr>
         <w:pStyle w:val="Textoindependiente"/>
+        <w:rPr>
+          <w:lang w:val="es-MX"/>
+        </w:rPr>
       </w:pPr>
       <w:r>
-        <w:t xml:space="preserve">Esto es útil para validar visualmente la legibilidad </w:t>
-      </w:r>
-      <w:r>
-        <w:t>de los PDFs en el Explorador o en aplicaciones nativas de Windows después de la conversión y compresión.</w:t>
+        <w:rPr>
+          <w:lang w:val="es-MX"/>
+        </w:rPr>
+        <w:t>Esto es útil para validar visualmente la legibilidad de los PDFs en el Explorador o en aplicaciones nativas de Windows después de la conversión y compresión.</w:t>
       </w:r>
     </w:p>
     <w:p>
       <w:pPr>
         <w:pStyle w:val="Textoindependiente"/>
+        <w:rPr>
+          <w:lang w:val="es-MX"/>
+        </w:rPr>
       </w:pPr>
       <w:r>
-        <w:t>Se recomienda ejecutar este script solo si los archivos provienen de fuentes externas y muestran el mensaje “Este archivo proviene de otro equipo y pue</w:t>
-      </w:r>
-      <w:r>
-        <w:t>de ser peligroso”.</w:t>
+        <w:rPr>
+          <w:lang w:val="es-MX"/>
+        </w:rPr>
+        <w:t>Se recomienda ejecutar este script solo si los archivos provienen de fuentes externas y muestran el mensaje “Este archivo proviene de otro equipo y puede ser peligroso”.</w:t>
       </w:r>
     </w:p>
     <w:p>
       <w:pPr>
         <w:pStyle w:val="Ttulo2"/>
+        <w:rPr>
+          <w:lang w:val="es-MX"/>
+        </w:rPr>
       </w:pPr>
       <w:r>
+        <w:rPr>
+          <w:lang w:val="es-MX"/>
+        </w:rPr>
         <w:t>4. Detalle de Salidas por Script</w:t>
       </w:r>
     </w:p>
     <w:p>
       <w:pPr>
         <w:pStyle w:val="Ttulo3"/>
+        <w:rPr>
+          <w:lang w:val="es-MX"/>
+        </w:rPr>
       </w:pPr>
       <w:r>
+        <w:rPr>
+          <w:lang w:val="es-MX"/>
+        </w:rPr>
         <w:t>convert_images_to_pdfs_recursive_this.sh</w:t>
       </w:r>
     </w:p>
     <w:p>
       <w:pPr>
         <w:pStyle w:val="Textoindependiente"/>
+        <w:rPr>
+          <w:lang w:val="es-MX"/>
+        </w:rPr>
       </w:pPr>
       <w:r>
+        <w:rPr>
+          <w:lang w:val="es-MX"/>
+        </w:rPr>
         <w:t>Salida principal:</w:t>
       </w:r>
     </w:p>
     <w:p>
       <w:pPr>
         <w:pStyle w:val="Listaconvietas"/>
+        <w:rPr>
+          <w:lang w:val="es-MX"/>
+        </w:rPr>
       </w:pPr>
       <w:r>
+        <w:rPr>
+          <w:lang w:val="es-MX"/>
+        </w:rPr>
+        <w:lastRenderedPageBreak/>
         <w:t>PDFs generados con el mismo nombre base que la imagen original y extensión .pdf (por ejemplo, imagen.jpg → imagen.pdf).</w:t>
       </w:r>
     </w:p>
     <w:p>
       <w:pPr>
         <w:pStyle w:val="Listaconvietas"/>
+        <w:rPr>
+          <w:lang w:val="es-MX"/>
+        </w:rPr>
       </w:pPr>
       <w:r>
-        <w:t>Este script elimina el ar</w:t>
-      </w:r>
-      <w:r>
-        <w:t>chivo de imagen original después de convertirlo correctamente.</w:t>
+        <w:rPr>
+          <w:lang w:val="es-MX"/>
+        </w:rPr>
+        <w:t>Este script elimina el archivo de imagen original después de convertirlo correctamente.</w:t>
       </w:r>
     </w:p>
     <w:p>
       <w:pPr>
         <w:pStyle w:val="Listaconvietas"/>
+        <w:rPr>
+          <w:lang w:val="es-MX"/>
+        </w:rPr>
       </w:pPr>
       <w:r>
+        <w:rPr>
+          <w:lang w:val="es-MX"/>
+        </w:rPr>
         <w:t>Archivo de registro:</w:t>
       </w:r>
     </w:p>
     <w:p>
       <w:pPr>
         <w:pStyle w:val="Sinespaciado"/>
+        <w:rPr>
+          <w:lang w:val="es-MX"/>
+        </w:rPr>
       </w:pPr>
       <w:r>
         <w:rPr>
           <w:rFonts w:ascii="Consolas" w:eastAsia="Consolas" w:hAnsi="Consolas"/>
           <w:sz w:val="20"/>
-        </w:rPr>
-        <w:t>images_to_pdf_log_YYYY-MM-DD HH:MM:SS.txt</w:t>
+          <w:lang w:val="es-MX"/>
+        </w:rPr>
+        <w:t>Images_to_pdf_log_YYYY-MM-DD</w:t>
+      </w:r>
+      <w:r>
+        <w:rPr>
+          <w:rFonts w:ascii="Consolas" w:eastAsia="Consolas" w:hAnsi="Consolas"/>
+          <w:sz w:val="20"/>
+          <w:lang w:val="es-MX"/>
+        </w:rPr>
+        <w:t xml:space="preserve"> HH:MM:SS.txt</w:t>
       </w:r>
     </w:p>
     <w:p>
       <w:pPr>
         <w:pStyle w:val="Listaconvietas"/>
+        <w:rPr>
+          <w:lang w:val="es-MX"/>
+        </w:rPr>
       </w:pPr>
       <w:r>
+        <w:rPr>
+          <w:lang w:val="es-MX"/>
+        </w:rPr>
         <w:t>Ubicación: el directorio donde se ejecuta el script.</w:t>
       </w:r>
     </w:p>
     <w:p>
       <w:pPr>
         <w:pStyle w:val="Ttulo3"/>
-      </w:pPr>
-      <w:bookmarkStart w:id="0" w:name="_GoBack"/>
-      <w:bookmarkEnd w:id="0"/>
+        <w:rPr>
+          <w:lang w:val="es-MX"/>
+        </w:rPr>
+      </w:pPr>
       <w:r>
+        <w:rPr>
+          <w:lang w:val="es-MX"/>
+        </w:rPr>
         <w:t>list_1M_PDF_large_files_this.sh</w:t>
       </w:r>
     </w:p>
     <w:p>
       <w:pPr>
         <w:pStyle w:val="Textoindependiente"/>
+        <w:rPr>
+          <w:lang w:val="es-MX"/>
+        </w:rPr>
       </w:pPr>
       <w:r>
+        <w:rPr>
+          <w:lang w:val="es-MX"/>
+        </w:rPr>
         <w:t>Salida principal:</w:t>
       </w:r>
     </w:p>
     <w:p>
       <w:pPr>
         <w:pStyle w:val="Listaconvietas"/>
+        <w:rPr>
+          <w:lang w:val="es-MX"/>
+        </w:rPr>
       </w:pPr>
       <w:r>
-        <w:lastRenderedPageBreak/>
+        <w:rPr>
+          <w:lang w:val="es-MX"/>
+        </w:rPr>
         <w:t>Archivo de texto con listado de PDFs mayores a 1MB.</w:t>
       </w:r>
     </w:p>
     <w:p>
       <w:pPr>
         <w:pStyle w:val="Sinespaciado"/>
+        <w:rPr>
+          <w:lang w:val="es-MX"/>
+        </w:rPr>
       </w:pPr>
       <w:r>
         <w:rPr>
           <w:rFonts w:ascii="Consolas" w:eastAsia="Consolas" w:hAnsi="Consolas"/>
           <w:sz w:val="20"/>
-        </w:rPr>
-        <w:t>li</w:t>
-      </w:r>
-      <w:r>
-        <w:rPr>
-          <w:rFonts w:ascii="Consolas" w:eastAsia="Consolas" w:hAnsi="Consolas"/>
-          <w:sz w:val="20"/>
-        </w:rPr>
-        <w:t>stado_PDFs_&gt;_1M_YYYY-MM-DD HH:MM.txt</w:t>
+          <w:lang w:val="es-MX"/>
+        </w:rPr>
+        <w:t>listado_PDFs_&gt;_1M_YYYY-MM-DD HH:MM.txt</w:t>
       </w:r>
     </w:p>
     <w:p>
       <w:pPr>
         <w:pStyle w:val="Listaconvietas"/>
+        <w:rPr>
+          <w:lang w:val="es-MX"/>
+        </w:rPr>
       </w:pPr>
       <w:r>
+        <w:rPr>
+          <w:lang w:val="es-MX"/>
+        </w:rPr>
         <w:t>Ubicación: el directorio donde se ejecuta el script.</w:t>
       </w:r>
     </w:p>
     <w:p>
       <w:pPr>
         <w:pStyle w:val="Ttulo3"/>
+        <w:rPr>
+          <w:lang w:val="es-MX"/>
+        </w:rPr>
       </w:pPr>
       <w:r>
+        <w:rPr>
+          <w:lang w:val="es-MX"/>
+        </w:rPr>
         <w:t>list_4MB_large_files_this.sh</w:t>
       </w:r>
     </w:p>
     <w:p>
       <w:pPr>
         <w:pStyle w:val="Textoindependiente"/>
+        <w:rPr>
+          <w:lang w:val="es-MX"/>
+        </w:rPr>
       </w:pPr>
       <w:r>
+        <w:rPr>
+          <w:lang w:val="es-MX"/>
+        </w:rPr>
         <w:t>Salida principal:</w:t>
       </w:r>
     </w:p>
     <w:p>
       <w:pPr>
         <w:pStyle w:val="Listaconvietas"/>
+        <w:rPr>
+          <w:lang w:val="es-MX"/>
+        </w:rPr>
       </w:pPr>
       <w:r>
+        <w:rPr>
+          <w:lang w:val="es-MX"/>
+        </w:rPr>
         <w:t>Archivo de texto con listado de archivos mayores a 4MB.</w:t>
       </w:r>
     </w:p>
     <w:p>
       <w:pPr>
         <w:pStyle w:val="Sinespaciado"/>
+        <w:rPr>
+          <w:lang w:val="es-MX"/>
+        </w:rPr>
       </w:pPr>
       <w:r>
         <w:rPr>
           <w:rFonts w:ascii="Consolas" w:eastAsia="Consolas" w:hAnsi="Consolas"/>
           <w:sz w:val="20"/>
+          <w:lang w:val="es-MX"/>
         </w:rPr>
         <w:t>archivos_4M_YYYY-MM-DD HH:MM.txt</w:t>
       </w:r>
@@ -1322,46 +1687,84 @@
     <w:p>
       <w:pPr>
         <w:pStyle w:val="Listaconvietas"/>
+        <w:rPr>
+          <w:lang w:val="es-MX"/>
+        </w:rPr>
       </w:pPr>
       <w:r>
-        <w:t>Ubicación: el directorio donde</w:t>
-      </w:r>
-      <w:r>
-        <w:t xml:space="preserve"> se ejecuta el script.</w:t>
+        <w:rPr>
+          <w:lang w:val="es-MX"/>
+        </w:rPr>
+        <w:t>Ubicación: el directorio donde se ejecuta el script.</w:t>
       </w:r>
     </w:p>
     <w:p>
       <w:pPr>
         <w:pStyle w:val="Ttulo3"/>
+        <w:rPr>
+          <w:lang w:val="es-MX"/>
+        </w:rPr>
       </w:pPr>
       <w:r>
+        <w:rPr>
+          <w:lang w:val="es-MX"/>
+        </w:rPr>
         <w:t>unlock_files_recursive_this.sh (opcional)</w:t>
       </w:r>
     </w:p>
     <w:p>
       <w:pPr>
         <w:pStyle w:val="Textoindependiente"/>
+        <w:rPr>
+          <w:lang w:val="es-MX"/>
+        </w:rPr>
       </w:pPr>
       <w:r>
+        <w:rPr>
+          <w:lang w:val="es-MX"/>
+        </w:rPr>
         <w:t>Salida principal:</w:t>
       </w:r>
     </w:p>
     <w:p>
       <w:pPr>
         <w:pStyle w:val="Listaconvietas"/>
+        <w:rPr>
+          <w:lang w:val="es-MX"/>
+        </w:rPr>
       </w:pPr>
       <w:r>
-        <w:t>Archivo de registro con el resultado del desbloqueo de archivos PDF.</w:t>
+        <w:rPr>
+          <w:lang w:val="es-MX"/>
+        </w:rPr>
+        <w:t xml:space="preserve">Archivo de registro con el </w:t>
+      </w:r>
+      <w:r>
+        <w:rPr>
+          <w:u w:val="single"/>
+          <w:lang w:val="es-MX"/>
+        </w:rPr>
+        <w:t>resultado</w:t>
+      </w:r>
+      <w:r>
+        <w:rPr>
+          <w:lang w:val="es-MX"/>
+        </w:rPr>
+        <w:t xml:space="preserve"> del desbloqueo de archivos PDF.</w:t>
       </w:r>
     </w:p>
     <w:p>
       <w:pPr>
         <w:pStyle w:val="Sinespaciado"/>
+        <w:rPr>
+          <w:lang w:val="es-MX"/>
+        </w:rPr>
       </w:pPr>
       <w:r>
         <w:rPr>
           <w:rFonts w:ascii="Consolas" w:eastAsia="Consolas" w:hAnsi="Consolas"/>
           <w:sz w:val="20"/>
+          <w:lang w:val="es-MX"/>
         </w:rPr>
         <w:t>unlockedFiles_logYYYY-MM-DD HH:MM.txt</w:t>
       </w:r>
@@ -1369,39 +1772,57 @@
     <w:p>
       <w:pPr>
         <w:pStyle w:val="Listaconvietas"/>
+        <w:rPr>
+          <w:lang w:val="es-MX"/>
+        </w:rPr>
       </w:pPr>
       <w:r>
+        <w:rPr>
+          <w:lang w:val="es-MX"/>
+        </w:rPr>
         <w:t>Ubicación: el directorio donde se ejecuta el script.</w:t>
       </w:r>
     </w:p>
     <w:p>
       <w:pPr>
         <w:pStyle w:val="Ttulo2"/>
+        <w:rPr>
+          <w:lang w:val="es-MX"/>
+        </w:rPr>
       </w:pPr>
       <w:r>
-        <w:t xml:space="preserve">5. </w:t>
-      </w:r>
-      <w:r>
-        <w:t>Recomendaciones adicionales</w:t>
+        <w:rPr>
+          <w:lang w:val="es-MX"/>
+        </w:rPr>
+        <w:t>5. Recomendaciones adicionales</w:t>
       </w:r>
     </w:p>
     <w:p>
       <w:pPr>
         <w:pStyle w:val="Textoindependiente"/>
+        <w:rPr>
+          <w:lang w:val="es-MX"/>
+        </w:rPr>
       </w:pPr>
       <w:r>
+        <w:rPr>
+          <w:lang w:val="es-MX"/>
+        </w:rPr>
         <w:t>Antes de ejecutar los scripts, haga una copia de seguridad de los archivos originales si es necesario. El script de compresión sobrescribe PDFs existentes y el de conversión elimina las imágenes originales.</w:t>
       </w:r>
     </w:p>
     <w:p>
       <w:pPr>
         <w:pStyle w:val="Textoindependiente"/>
+        <w:rPr>
+          <w:lang w:val="es-MX"/>
+        </w:rPr>
       </w:pPr>
       <w:r>
-        <w:t xml:space="preserve">Al usar los listados </w:t>
-      </w:r>
-      <w:r>
-        <w:t>de archivos grandes, revise los registros generados para identificar documentos que aún pueden necesitar ajustes manuales.</w:t>
+        <w:rPr>
+          <w:lang w:val="es-MX"/>
+        </w:rPr>
+        <w:t>Al usar los listados de archivos grandes, revise los registros generados para identificar documentos que aún pueden necesitar ajustes manuales.</w:t>
       </w:r>
     </w:p>
     <w:sectPr>
@@ -13331,7 +13752,7 @@
 </file>
 
 <file path=customXml/itemProps1.xml><?xml version="1.0" encoding="utf-8"?>
-<ds:datastoreItem xmlns:ds="http://schemas.openxmlformats.org/officeDocument/2006/customXml" ds:itemID="{1E90ABD5-020B-4047-9C55-2F20B0225386}">
+<ds:datastoreItem xmlns:ds="http://schemas.openxmlformats.org/officeDocument/2006/customXml" ds:itemID="{3834A667-A654-48F3-9EBF-752F8974B988}">
   <ds:schemaRefs>
     <ds:schemaRef ds:uri="http://schemas.openxmlformats.org/officeDocument/2006/bibliography"/>
   </ds:schemaRefs>

</xml_diff>

<commit_message>
docs(manual): update execution instructions and adjust GS profiles
- Add requirement note for `C:\tmp` directory in Windows execution manual
- Adjust Ghostscript color image resolution to 180 DPI for better diagram visibility
- Update documentation links and comments regarding compression profiles
</commit_message>
<xml_diff>
--- a/Manual_Ejecucion_Scripts_Bash_Windows.docx
+++ b/Manual_Ejecucion_Scripts_Bash_Windows.docx
@@ -162,15 +162,46 @@
     <w:p>
       <w:pPr>
         <w:pStyle w:val="Listaconnmeros"/>
-        <w:rPr>
-          <w:lang w:val="es-MX"/>
-        </w:rPr>
-      </w:pPr>
-      <w:r>
-        <w:rPr>
-          <w:lang w:val="es-MX"/>
-        </w:rPr>
-        <w:t>Asegúrese de seleccionar “Git from the command line and also from 3rd-party software” para agregar Git Bash al PATH.</w:t>
+      </w:pPr>
+      <w:proofErr w:type="spellStart"/>
+      <w:r>
+        <w:t>Asegúrese</w:t>
+      </w:r>
+      <w:proofErr w:type="spellEnd"/>
+      <w:r>
+        <w:t xml:space="preserve"> de </w:t>
+      </w:r>
+      <w:proofErr w:type="spellStart"/>
+      <w:r>
+        <w:t>seleccionar</w:t>
+      </w:r>
+      <w:proofErr w:type="spellEnd"/>
+      <w:r>
+        <w:t xml:space="preserve"> “</w:t>
+      </w:r>
+      <w:proofErr w:type="spellStart"/>
+      <w:r>
+        <w:t>Git</w:t>
+      </w:r>
+      <w:proofErr w:type="spellEnd"/>
+      <w:r>
+        <w:t xml:space="preserve"> from the command line and also from 3rd-party software” para </w:t>
+      </w:r>
+      <w:proofErr w:type="spellStart"/>
+      <w:r>
+        <w:t>agregar</w:t>
+      </w:r>
+      <w:proofErr w:type="spellEnd"/>
+      <w:r>
+        <w:t xml:space="preserve"> </w:t>
+      </w:r>
+      <w:proofErr w:type="spellStart"/>
+      <w:r>
+        <w:t>Git</w:t>
+      </w:r>
+      <w:proofErr w:type="spellEnd"/>
+      <w:r>
+        <w:t xml:space="preserve"> Bash al PATH.</w:t>
       </w:r>
     </w:p>
     <w:p>
@@ -389,15 +420,11 @@
     <w:p>
       <w:pPr>
         <w:pStyle w:val="Sinespaciado"/>
-        <w:rPr>
-          <w:lang w:val="es-MX"/>
-        </w:rPr>
       </w:pPr>
       <w:r>
         <w:rPr>
           <w:rFonts w:ascii="Consolas" w:eastAsia="Consolas" w:hAnsi="Consolas"/>
           <w:sz w:val="20"/>
-          <w:lang w:val="es-MX"/>
         </w:rPr>
         <w:t>gswin64c --version</w:t>
       </w:r>
@@ -405,28 +432,16 @@
     <w:p>
       <w:pPr>
         <w:pStyle w:val="Ttulo4"/>
-        <w:rPr>
-          <w:lang w:val="es-MX"/>
-        </w:rPr>
-      </w:pPr>
-      <w:r>
-        <w:rPr>
-          <w:lang w:val="es-MX"/>
-        </w:rPr>
+      </w:pPr>
+      <w:r>
         <w:t>ImageMagick</w:t>
       </w:r>
     </w:p>
     <w:p>
       <w:pPr>
         <w:pStyle w:val="Textoindependiente"/>
-        <w:rPr>
-          <w:lang w:val="es-MX"/>
-        </w:rPr>
-      </w:pPr>
-      <w:r>
-        <w:rPr>
-          <w:lang w:val="es-MX"/>
-        </w:rPr>
+      </w:pPr>
+      <w:r>
         <w:t>ImageMagick convierte archivos JPG/JPEG/PNG a PDF mediante el script convert_images_to_pdfs_recursive_this.sh.</w:t>
       </w:r>
     </w:p>
@@ -475,14 +490,8 @@
     <w:p>
       <w:pPr>
         <w:pStyle w:val="Listaconnmeros"/>
-        <w:rPr>
-          <w:lang w:val="es-MX"/>
-        </w:rPr>
-      </w:pPr>
-      <w:r>
-        <w:rPr>
-          <w:lang w:val="es-MX"/>
-        </w:rPr>
+      </w:pPr>
+      <w:r>
         <w:t>Asegúrese de que “Add application directory to your system PATH” esté activado.</w:t>
       </w:r>
     </w:p>
@@ -547,55 +556,61 @@
     <w:p>
       <w:pPr>
         <w:pStyle w:val="Textoindependiente"/>
-        <w:rPr>
-          <w:lang w:val="es-MX"/>
-        </w:rPr>
-      </w:pPr>
-      <w:r>
-        <w:rPr>
-          <w:lang w:val="es-MX"/>
-        </w:rPr>
+      </w:pPr>
+      <w:r>
         <w:t>PowerShell viene instalado por defecto en Windows 10 y Windows 11. El script invoca powershell.exe desde Git Bash.</w:t>
       </w:r>
     </w:p>
     <w:p>
       <w:pPr>
         <w:pStyle w:val="Textoindependiente"/>
-        <w:rPr>
-          <w:lang w:val="es-MX"/>
-        </w:rPr>
       </w:pPr>
     </w:p>
     <w:p>
       <w:pPr>
         <w:pStyle w:val="Ttulo4"/>
-        <w:rPr>
-          <w:lang w:val="es-MX"/>
-        </w:rPr>
-      </w:pPr>
-      <w:r>
-        <w:rPr>
-          <w:lang w:val="es-MX"/>
-        </w:rPr>
+      </w:pPr>
+      <w:r>
         <w:t>Playwright</w:t>
       </w:r>
     </w:p>
     <w:p>
       <w:pPr>
         <w:pStyle w:val="Textoindependiente"/>
-        <w:rPr>
-          <w:lang w:val="es-MX"/>
-        </w:rPr>
-      </w:pPr>
-      <w:hyperlink r:id="rId6" w:anchor="system-requirements" w:history="1">
-        <w:r>
-          <w:rPr>
-            <w:rStyle w:val="Hipervnculo"/>
-            <w:lang w:val="es-MX"/>
-          </w:rPr>
-          <w:t>https://playwright.dev/docs/intro#system-requirements</w:t>
-        </w:r>
-      </w:hyperlink>
+      </w:pPr>
+      <w:r>
+        <w:rPr>
+          <w:rStyle w:val="Hipervnculo"/>
+          <w:lang w:val="es-MX"/>
+        </w:rPr>
+        <w:fldChar w:fldCharType="begin"/>
+      </w:r>
+      <w:r>
+        <w:rPr>
+          <w:rStyle w:val="Hipervnculo"/>
+        </w:rPr>
+        <w:instrText xml:space="preserve"> HYPERLINK "https://playwright.dev/docs/intro" \l "system-requirements" </w:instrText>
+      </w:r>
+      <w:r>
+        <w:rPr>
+          <w:rStyle w:val="Hipervnculo"/>
+          <w:lang w:val="es-MX"/>
+        </w:rPr>
+        <w:fldChar w:fldCharType="separate"/>
+      </w:r>
+      <w:r>
+        <w:rPr>
+          <w:rStyle w:val="Hipervnculo"/>
+        </w:rPr>
+        <w:t>https://playwright.dev/docs/intro#system-requirements</w:t>
+      </w:r>
+      <w:r>
+        <w:rPr>
+          <w:rStyle w:val="Hipervnculo"/>
+          <w:lang w:val="es-MX"/>
+        </w:rPr>
+        <w:fldChar w:fldCharType="end"/>
+      </w:r>
     </w:p>
     <w:p>
       <w:pPr>
@@ -1047,31 +1062,18 @@
           <w:numId w:val="0"/>
         </w:numPr>
         <w:ind w:left="360"/>
-        <w:rPr>
-          <w:u w:val="single"/>
-          <w:lang w:val="es-MX"/>
-        </w:rPr>
-      </w:pPr>
-      <w:r>
-        <w:rPr>
-          <w:lang w:val="es-MX"/>
-        </w:rPr>
+      </w:pPr>
+      <w:r>
         <w:t xml:space="preserve"># 5. Run the </w:t>
       </w:r>
       <w:r>
-        <w:rPr>
-          <w:lang w:val="es-MX"/>
-        </w:rPr>
-        <w:t>PDFs</w:t>
-      </w:r>
-      <w:bookmarkStart w:id="0" w:name="_GoBack"/>
-      <w:bookmarkEnd w:id="0"/>
-      <w:r>
-        <w:rPr>
-          <w:lang w:val="es-MX"/>
-        </w:rPr>
-        <w:t xml:space="preserve"> compresión</w:t>
-      </w:r>
+        <w:t xml:space="preserve">PDFs </w:t>
+      </w:r>
+      <w:proofErr w:type="spellStart"/>
+      <w:r>
+        <w:t>compresión</w:t>
+      </w:r>
+      <w:proofErr w:type="spellEnd"/>
     </w:p>
     <w:p>
       <w:pPr>
@@ -1081,26 +1083,26 @@
           <w:numId w:val="0"/>
         </w:numPr>
         <w:ind w:left="360"/>
-      </w:pPr>
-      <w:r>
-        <w:t>npx playwright test src/tests/</w:t>
-      </w:r>
-      <w:r>
-        <w:rPr>
-          <w:b/>
-        </w:rPr>
-        <w:t>compressPDFsThis</w:t>
-      </w:r>
-      <w:r>
-        <w:rPr>
-          <w:b/>
-        </w:rPr>
-        <w:t>V2</w:t>
-      </w:r>
-      <w:r>
-        <w:t>.spec.ts</w:t>
+        <w:rPr>
+          <w:u w:val="single"/>
+        </w:rPr>
+      </w:pPr>
+      <w:bookmarkStart w:id="0" w:name="_GoBack"/>
+      <w:r>
+        <w:t xml:space="preserve">Note: Make sure the </w:t>
+      </w:r>
+      <w:r>
+        <w:rPr>
+          <w:rStyle w:val="CdigoHTML"/>
+          <w:rFonts w:eastAsiaTheme="minorEastAsia"/>
+        </w:rPr>
+        <w:t>C:\tmp</w:t>
+      </w:r>
+      <w:r>
+        <w:t xml:space="preserve"> folder exists on your system before running the script</w:t>
       </w:r>
     </w:p>
+    <w:bookmarkEnd w:id="0"/>
     <w:p>
       <w:pPr>
         <w:pStyle w:val="Listaconnmeros"/>
@@ -1110,6 +1112,37 @@
         </w:numPr>
         <w:ind w:left="360"/>
       </w:pPr>
+      <w:proofErr w:type="spellStart"/>
+      <w:r>
+        <w:t>npx</w:t>
+      </w:r>
+      <w:proofErr w:type="spellEnd"/>
+      <w:r>
+        <w:t xml:space="preserve"> playwright test </w:t>
+      </w:r>
+      <w:proofErr w:type="spellStart"/>
+      <w:r>
+        <w:t>src</w:t>
+      </w:r>
+      <w:proofErr w:type="spellEnd"/>
+      <w:r>
+        <w:t>/tests/</w:t>
+      </w:r>
+      <w:r>
+        <w:rPr>
+          <w:b/>
+        </w:rPr>
+        <w:t>compressPDFsThis</w:t>
+      </w:r>
+      <w:r>
+        <w:rPr>
+          <w:b/>
+        </w:rPr>
+        <w:t>V2</w:t>
+      </w:r>
+      <w:r>
+        <w:t>.spec.ts</w:t>
+      </w:r>
     </w:p>
     <w:p>
       <w:pPr>
@@ -1119,16 +1152,7 @@
           <w:numId w:val="0"/>
         </w:numPr>
         <w:ind w:left="360"/>
-        <w:rPr>
-          <w:lang w:val="es-MX"/>
-        </w:rPr>
-      </w:pPr>
-      <w:r>
-        <w:rPr>
-          <w:lang w:val="es-MX"/>
-        </w:rPr>
-        <w:t># 6. Check execution report:</w:t>
-      </w:r>
+      </w:pPr>
     </w:p>
     <w:p>
       <w:pPr>
@@ -1138,15 +1162,9 @@
           <w:numId w:val="0"/>
         </w:numPr>
         <w:ind w:left="360"/>
-        <w:rPr>
-          <w:lang w:val="es-MX"/>
-        </w:rPr>
-      </w:pPr>
-      <w:r>
-        <w:rPr>
-          <w:lang w:val="es-MX"/>
-        </w:rPr>
-        <w:t>npx playwright show-report</w:t>
+      </w:pPr>
+      <w:r>
+        <w:t># 6. Check execution report:</w:t>
       </w:r>
     </w:p>
     <w:p>
@@ -1157,10 +1175,15 @@
           <w:numId w:val="0"/>
         </w:numPr>
         <w:ind w:left="360"/>
-        <w:rPr>
-          <w:lang w:val="es-MX"/>
-        </w:rPr>
-      </w:pPr>
+      </w:pPr>
+      <w:proofErr w:type="spellStart"/>
+      <w:r>
+        <w:t>npx</w:t>
+      </w:r>
+      <w:proofErr w:type="spellEnd"/>
+      <w:r>
+        <w:t xml:space="preserve"> playwright show-report</w:t>
+      </w:r>
     </w:p>
     <w:p>
       <w:pPr>
@@ -1171,15 +1194,6 @@
         </w:numPr>
         <w:ind w:left="360"/>
       </w:pPr>
-      <w:r>
-        <w:t xml:space="preserve"># </w:t>
-      </w:r>
-      <w:r>
-        <w:t xml:space="preserve">7. </w:t>
-      </w:r>
-      <w:r>
-        <w:t>list_1M_PDF_large_files_this.sh</w:t>
-      </w:r>
     </w:p>
     <w:p>
       <w:pPr>
@@ -1191,10 +1205,13 @@
         <w:ind w:left="360"/>
       </w:pPr>
       <w:r>
-        <w:t xml:space="preserve"># 8. </w:t>
-      </w:r>
-      <w:r>
-        <w:t>list_4MB_large_files_this.sh</w:t>
+        <w:t xml:space="preserve"># </w:t>
+      </w:r>
+      <w:r>
+        <w:t xml:space="preserve">7. </w:t>
+      </w:r>
+      <w:r>
+        <w:t>list_1M_PDF_large_files_this.sh</w:t>
       </w:r>
     </w:p>
     <w:p>
@@ -1205,33 +1222,12 @@
           <w:numId w:val="0"/>
         </w:numPr>
         <w:ind w:left="360"/>
-        <w:rPr>
-          <w:lang w:val="es-MX"/>
-        </w:rPr>
-      </w:pPr>
-      <w:r>
-        <w:rPr>
-          <w:lang w:val="es-MX"/>
-        </w:rPr>
-        <w:t xml:space="preserve"># 9. Correr el archive de </w:t>
-      </w:r>
-      <w:r>
-        <w:rPr>
-          <w:lang w:val="es-MX"/>
-        </w:rPr>
-        <w:t xml:space="preserve">Python para dividir los pdf mayores a 4 MBs para que se puedan zippiar, </w:t>
-      </w:r>
-      <w:r>
-        <w:rPr>
-          <w:lang w:val="es-MX"/>
-        </w:rPr>
-        <w:t>DEFAULT_DIR = "/c/githubProjects/playwrightProjects/pdfValidator/pdfs"</w:t>
-      </w:r>
-      <w:r>
-        <w:rPr>
-          <w:lang w:val="es-MX"/>
-        </w:rPr>
-        <w:t>:</w:t>
+      </w:pPr>
+      <w:r>
+        <w:t xml:space="preserve"># 8. </w:t>
+      </w:r>
+      <w:r>
+        <w:t>list_4MB_large_files_this.sh</w:t>
       </w:r>
     </w:p>
     <w:p>
@@ -1246,6 +1242,30 @@
           <w:lang w:val="es-MX"/>
         </w:rPr>
       </w:pPr>
+      <w:r>
+        <w:rPr>
+          <w:lang w:val="es-MX"/>
+        </w:rPr>
+        <w:t xml:space="preserve"># 9. Correr el archive de </w:t>
+      </w:r>
+      <w:r>
+        <w:rPr>
+          <w:lang w:val="es-MX"/>
+        </w:rPr>
+        <w:t xml:space="preserve">Python para dividir los pdf mayores a 4 MBs para que se puedan zippiar, </w:t>
+      </w:r>
+      <w:r>
+        <w:rPr>
+          <w:lang w:val="es-MX"/>
+        </w:rPr>
+        <w:t>DEFAULT_DIR = "/c/githubProjects/playwrightProjects/pdfValidator/pdfs"</w:t>
+      </w:r>
+      <w:r>
+        <w:rPr>
+          <w:lang w:val="es-MX"/>
+        </w:rPr>
+        <w:t>:</w:t>
+      </w:r>
     </w:p>
     <w:p>
       <w:pPr>
@@ -1255,16 +1275,10 @@
           <w:numId w:val="0"/>
         </w:numPr>
         <w:ind w:left="360"/>
-      </w:pPr>
-      <w:r>
-        <w:t>“p</w:t>
-      </w:r>
-      <w:r>
-        <w:t>ython split_4M_PDF_python</w:t>
-      </w:r>
-      <w:r>
-        <w:t>.py”</w:t>
-      </w:r>
+        <w:rPr>
+          <w:lang w:val="es-MX"/>
+        </w:rPr>
+      </w:pPr>
     </w:p>
     <w:p>
       <w:pPr>
@@ -1275,6 +1289,15 @@
         </w:numPr>
         <w:ind w:left="360"/>
       </w:pPr>
+      <w:r>
+        <w:t>“p</w:t>
+      </w:r>
+      <w:r>
+        <w:t>ython split_4M_PDF_python</w:t>
+      </w:r>
+      <w:r>
+        <w:t>.py”</w:t>
+      </w:r>
     </w:p>
     <w:p>
       <w:pPr>
@@ -1284,46 +1307,7 @@
           <w:numId w:val="0"/>
         </w:numPr>
         <w:ind w:left="360"/>
-        <w:rPr>
-          <w:lang w:val="es-MX"/>
-        </w:rPr>
-      </w:pPr>
-      <w:r>
-        <w:rPr>
-          <w:lang w:val="es-MX"/>
-        </w:rPr>
-        <w:t xml:space="preserve"># 10. Correr el Zippiador </w:t>
-      </w:r>
-      <w:r>
-        <w:rPr>
-          <w:lang w:val="es-MX"/>
-        </w:rPr>
-        <w:t xml:space="preserve">de Python </w:t>
-      </w:r>
-      <w:r>
-        <w:rPr>
-          <w:lang w:val="es-MX"/>
-        </w:rPr>
-        <w:t>con W</w:t>
-      </w:r>
-      <w:r>
-        <w:rPr>
-          <w:lang w:val="es-MX"/>
-        </w:rPr>
-        <w:t xml:space="preserve">inRAR, default </w:t>
-      </w:r>
-      <w:r>
-        <w:rPr>
-          <w:lang w:val="es-MX"/>
-        </w:rPr>
-        <w:t>--limite 4mb</w:t>
-      </w:r>
-      <w:r>
-        <w:rPr>
-          <w:lang w:val="es-MX"/>
-        </w:rPr>
-        <w:t xml:space="preserve"> de los ZIPs files:</w:t>
-      </w:r>
+      </w:pPr>
     </w:p>
     <w:p>
       <w:pPr>
@@ -1341,66 +1325,82 @@
         <w:rPr>
           <w:lang w:val="es-MX"/>
         </w:rPr>
-        <w:t xml:space="preserve">“python </w:t>
-      </w:r>
-      <w:r>
-        <w:rPr>
-          <w:lang w:val="es-MX"/>
-        </w:rPr>
-        <w:t>compresor.py</w:t>
-      </w:r>
-      <w:r>
-        <w:rPr>
-          <w:lang w:val="es-MX"/>
-        </w:rPr>
-        <w:t>”</w:t>
+        <w:t xml:space="preserve"># 10. Correr el Zippiador </w:t>
+      </w:r>
+      <w:r>
+        <w:rPr>
+          <w:lang w:val="es-MX"/>
+        </w:rPr>
+        <w:t xml:space="preserve">de Python </w:t>
+      </w:r>
+      <w:r>
+        <w:rPr>
+          <w:lang w:val="es-MX"/>
+        </w:rPr>
+        <w:t>con W</w:t>
+      </w:r>
+      <w:r>
+        <w:rPr>
+          <w:lang w:val="es-MX"/>
+        </w:rPr>
+        <w:t xml:space="preserve">inRAR, default </w:t>
+      </w:r>
+      <w:r>
+        <w:rPr>
+          <w:lang w:val="es-MX"/>
+        </w:rPr>
+        <w:t>--limite 4mb</w:t>
+      </w:r>
+      <w:r>
+        <w:rPr>
+          <w:lang w:val="es-MX"/>
+        </w:rPr>
+        <w:t xml:space="preserve"> de los ZIPs files:</w:t>
       </w:r>
     </w:p>
     <w:p>
       <w:pPr>
-        <w:pStyle w:val="Ttulo2"/>
-        <w:rPr>
-          <w:lang w:val="es-MX"/>
-        </w:rPr>
-      </w:pPr>
-      <w:r>
-        <w:rPr>
-          <w:lang w:val="es-MX"/>
-        </w:rPr>
-        <w:t>3. Scripts Opcionales</w:t>
+        <w:pStyle w:val="Listaconnmeros"/>
+        <w:numPr>
+          <w:ilvl w:val="0"/>
+          <w:numId w:val="0"/>
+        </w:numPr>
+        <w:ind w:left="360"/>
+        <w:rPr>
+          <w:lang w:val="es-MX"/>
+        </w:rPr>
+      </w:pPr>
+      <w:r>
+        <w:rPr>
+          <w:lang w:val="es-MX"/>
+        </w:rPr>
+        <w:t xml:space="preserve">“python </w:t>
+      </w:r>
+      <w:r>
+        <w:rPr>
+          <w:lang w:val="es-MX"/>
+        </w:rPr>
+        <w:t>compresor.py</w:t>
+      </w:r>
+      <w:r>
+        <w:rPr>
+          <w:lang w:val="es-MX"/>
+        </w:rPr>
+        <w:t>”</w:t>
       </w:r>
     </w:p>
     <w:p>
       <w:pPr>
-        <w:pStyle w:val="Textoindependiente"/>
-        <w:rPr>
-          <w:lang w:val="es-MX"/>
-        </w:rPr>
-      </w:pPr>
-      <w:r>
-        <w:rPr>
-          <w:b/>
-          <w:lang w:val="es-MX"/>
-        </w:rPr>
-        <w:t>unlock_files_recursive_this.sh</w:t>
-      </w:r>
-      <w:r>
-        <w:rPr>
-          <w:lang w:val="es-MX"/>
-        </w:rPr>
-        <w:t xml:space="preserve"> es un script opcional que desbloquea archivos PDF descargados desde Internet. Úselo cuando Windows marque los archivos como bloqueados y no se puedan </w:t>
-      </w:r>
-      <w:r>
-        <w:rPr>
-          <w:lang w:val="es-MX"/>
-        </w:rPr>
-        <w:t>pre visualizar</w:t>
-      </w:r>
-      <w:r>
-        <w:rPr>
-          <w:lang w:val="es-MX"/>
-        </w:rPr>
-        <w:t xml:space="preserve"> o abrir correctamente en el Explorador de Windows.</w:t>
+        <w:pStyle w:val="Ttulo2"/>
+        <w:rPr>
+          <w:lang w:val="es-MX"/>
+        </w:rPr>
+      </w:pPr>
+      <w:r>
+        <w:rPr>
+          <w:lang w:val="es-MX"/>
+        </w:rPr>
+        <w:t>3. Scripts Opcionales</w:t>
       </w:r>
     </w:p>
     <w:p>
@@ -1412,9 +1412,28 @@
       </w:pPr>
       <w:r>
         <w:rPr>
-          <w:lang w:val="es-MX"/>
-        </w:rPr>
-        <w:t>Esto es útil para validar visualmente la legibilidad de los PDFs en el Explorador o en aplicaciones nativas de Windows después de la conversión y compresión.</w:t>
+          <w:b/>
+          <w:lang w:val="es-MX"/>
+        </w:rPr>
+        <w:t>unlock_files_recursive_this.sh</w:t>
+      </w:r>
+      <w:r>
+        <w:rPr>
+          <w:lang w:val="es-MX"/>
+        </w:rPr>
+        <w:t xml:space="preserve"> es un script opcional que desbloquea archivos PDF descargados desde Internet. Úselo cuando Windows marque los archivos como bloqueados y no se puedan </w:t>
+      </w:r>
+      <w:r>
+        <w:rPr>
+          <w:lang w:val="es-MX"/>
+        </w:rPr>
+        <w:t>pre visualizar</w:t>
+      </w:r>
+      <w:r>
+        <w:rPr>
+          <w:lang w:val="es-MX"/>
+        </w:rPr>
+        <w:t xml:space="preserve"> o abrir correctamente en el Explorador de Windows.</w:t>
       </w:r>
     </w:p>
     <w:p>
@@ -1428,53 +1447,67 @@
         <w:rPr>
           <w:lang w:val="es-MX"/>
         </w:rPr>
-        <w:t>Se recomienda ejecutar este script solo si los archivos provienen de fuentes externas y muestran el mensaje “Este archivo proviene de otro equipo y puede ser peligroso”.</w:t>
+        <w:t>Esto es útil para validar visualmente la legibilidad de los PDFs en el Explorador o en aplicaciones nativas de Windows después de la conversión y compresión.</w:t>
       </w:r>
     </w:p>
     <w:p>
       <w:pPr>
-        <w:pStyle w:val="Ttulo2"/>
-        <w:rPr>
-          <w:lang w:val="es-MX"/>
-        </w:rPr>
-      </w:pPr>
-      <w:r>
-        <w:rPr>
-          <w:lang w:val="es-MX"/>
-        </w:rPr>
-        <w:t>4. Detalle de Salidas por Script</w:t>
+        <w:pStyle w:val="Textoindependiente"/>
+        <w:rPr>
+          <w:lang w:val="es-MX"/>
+        </w:rPr>
+      </w:pPr>
+      <w:r>
+        <w:rPr>
+          <w:lang w:val="es-MX"/>
+        </w:rPr>
+        <w:t>Se recomienda ejecutar este script solo si los archivos provienen de fuentes externas y muestran el mensaje “Este archivo proviene de otro equipo y puede ser peligroso”.</w:t>
       </w:r>
     </w:p>
     <w:p>
       <w:pPr>
-        <w:pStyle w:val="Ttulo3"/>
-        <w:rPr>
-          <w:lang w:val="es-MX"/>
-        </w:rPr>
-      </w:pPr>
-      <w:r>
-        <w:rPr>
-          <w:lang w:val="es-MX"/>
-        </w:rPr>
-        <w:t>convert_images_to_pdfs_recursive_this.sh</w:t>
+        <w:pStyle w:val="Ttulo2"/>
+        <w:rPr>
+          <w:lang w:val="es-MX"/>
+        </w:rPr>
+      </w:pPr>
+      <w:r>
+        <w:rPr>
+          <w:lang w:val="es-MX"/>
+        </w:rPr>
+        <w:t>4. Detalle de Salidas por Script</w:t>
       </w:r>
     </w:p>
     <w:p>
       <w:pPr>
-        <w:pStyle w:val="Textoindependiente"/>
-        <w:rPr>
-          <w:lang w:val="es-MX"/>
-        </w:rPr>
-      </w:pPr>
-      <w:r>
-        <w:rPr>
-          <w:lang w:val="es-MX"/>
-        </w:rPr>
-        <w:t>Salida principal:</w:t>
+        <w:pStyle w:val="Ttulo3"/>
+        <w:rPr>
+          <w:lang w:val="es-MX"/>
+        </w:rPr>
+      </w:pPr>
+      <w:r>
+        <w:rPr>
+          <w:lang w:val="es-MX"/>
+        </w:rPr>
+        <w:t>convert_images_to_pdfs_recursive_this.sh</w:t>
       </w:r>
     </w:p>
     <w:p>
       <w:pPr>
+        <w:pStyle w:val="Textoindependiente"/>
+        <w:rPr>
+          <w:lang w:val="es-MX"/>
+        </w:rPr>
+      </w:pPr>
+      <w:r>
+        <w:rPr>
+          <w:lang w:val="es-MX"/>
+        </w:rPr>
+        <w:t>Salida principal:</w:t>
+      </w:r>
+    </w:p>
+    <w:p>
+      <w:pPr>
         <w:pStyle w:val="Listaconvietas"/>
         <w:rPr>
           <w:lang w:val="es-MX"/>
@@ -1519,26 +1552,39 @@
     <w:p>
       <w:pPr>
         <w:pStyle w:val="Sinespaciado"/>
-        <w:rPr>
-          <w:lang w:val="es-MX"/>
-        </w:rPr>
-      </w:pPr>
+      </w:pPr>
+      <w:proofErr w:type="spellStart"/>
       <w:r>
         <w:rPr>
           <w:rFonts w:ascii="Consolas" w:eastAsia="Consolas" w:hAnsi="Consolas"/>
           <w:sz w:val="20"/>
-          <w:lang w:val="es-MX"/>
-        </w:rPr>
-        <w:t>Images_to_pdf_log_YYYY-MM-DD</w:t>
-      </w:r>
+        </w:rPr>
+        <w:t>Images_to_pdf_log_YYYY</w:t>
+      </w:r>
+      <w:proofErr w:type="spellEnd"/>
       <w:r>
         <w:rPr>
           <w:rFonts w:ascii="Consolas" w:eastAsia="Consolas" w:hAnsi="Consolas"/>
           <w:sz w:val="20"/>
-          <w:lang w:val="es-MX"/>
-        </w:rPr>
-        <w:t xml:space="preserve"> HH:MM:SS.txt</w:t>
-      </w:r>
+        </w:rPr>
+        <w:t>-MM-DD</w:t>
+      </w:r>
+      <w:r>
+        <w:rPr>
+          <w:rFonts w:ascii="Consolas" w:eastAsia="Consolas" w:hAnsi="Consolas"/>
+          <w:sz w:val="20"/>
+        </w:rPr>
+        <w:t xml:space="preserve"> HH:MM</w:t>
+      </w:r>
+      <w:proofErr w:type="gramStart"/>
+      <w:r>
+        <w:rPr>
+          <w:rFonts w:ascii="Consolas" w:eastAsia="Consolas" w:hAnsi="Consolas"/>
+          <w:sz w:val="20"/>
+        </w:rPr>
+        <w:t>:SS.txt</w:t>
+      </w:r>
+      <w:proofErr w:type="gramEnd"/>
     </w:p>
     <w:p>
       <w:pPr>
@@ -1557,14 +1603,8 @@
     <w:p>
       <w:pPr>
         <w:pStyle w:val="Ttulo3"/>
-        <w:rPr>
-          <w:lang w:val="es-MX"/>
-        </w:rPr>
-      </w:pPr>
-      <w:r>
-        <w:rPr>
-          <w:lang w:val="es-MX"/>
-        </w:rPr>
+      </w:pPr>
+      <w:r>
         <w:t>list_1M_PDF_large_files_this.sh</w:t>
       </w:r>
     </w:p>
@@ -1629,14 +1669,8 @@
     <w:p>
       <w:pPr>
         <w:pStyle w:val="Ttulo3"/>
-        <w:rPr>
-          <w:lang w:val="es-MX"/>
-        </w:rPr>
-      </w:pPr>
-      <w:r>
-        <w:rPr>
-          <w:lang w:val="es-MX"/>
-        </w:rPr>
+      </w:pPr>
+      <w:r>
         <w:t>list_4MB_large_files_this.sh</w:t>
       </w:r>
     </w:p>
@@ -1701,15 +1735,17 @@
     <w:p>
       <w:pPr>
         <w:pStyle w:val="Ttulo3"/>
-        <w:rPr>
-          <w:lang w:val="es-MX"/>
-        </w:rPr>
-      </w:pPr>
-      <w:r>
-        <w:rPr>
-          <w:lang w:val="es-MX"/>
-        </w:rPr>
-        <w:t>unlock_files_recursive_this.sh (opcional)</w:t>
+      </w:pPr>
+      <w:r>
+        <w:t>unlock_files_recursive_this.sh (</w:t>
+      </w:r>
+      <w:proofErr w:type="spellStart"/>
+      <w:r>
+        <w:t>opcional</w:t>
+      </w:r>
+      <w:proofErr w:type="spellEnd"/>
+      <w:r>
+        <w:t>)</w:t>
       </w:r>
     </w:p>
     <w:p>
@@ -1756,17 +1792,31 @@
     <w:p>
       <w:pPr>
         <w:pStyle w:val="Sinespaciado"/>
-        <w:rPr>
-          <w:lang w:val="es-MX"/>
-        </w:rPr>
-      </w:pPr>
+      </w:pPr>
+      <w:proofErr w:type="spellStart"/>
+      <w:proofErr w:type="gramStart"/>
       <w:r>
         <w:rPr>
           <w:rFonts w:ascii="Consolas" w:eastAsia="Consolas" w:hAnsi="Consolas"/>
           <w:sz w:val="20"/>
-          <w:lang w:val="es-MX"/>
-        </w:rPr>
-        <w:t>unlockedFiles_logYYYY-MM-DD HH:MM.txt</w:t>
+        </w:rPr>
+        <w:t>unlockedFiles_logYYYY</w:t>
+      </w:r>
+      <w:proofErr w:type="spellEnd"/>
+      <w:r>
+        <w:rPr>
+          <w:rFonts w:ascii="Consolas" w:eastAsia="Consolas" w:hAnsi="Consolas"/>
+          <w:sz w:val="20"/>
+        </w:rPr>
+        <w:t>-MM-DD</w:t>
+      </w:r>
+      <w:proofErr w:type="gramEnd"/>
+      <w:r>
+        <w:rPr>
+          <w:rFonts w:ascii="Consolas" w:eastAsia="Consolas" w:hAnsi="Consolas"/>
+          <w:sz w:val="20"/>
+        </w:rPr>
+        <w:t xml:space="preserve"> HH:MM.txt</w:t>
       </w:r>
     </w:p>
     <w:p>
@@ -1972,7 +2022,7 @@
   <w:abstractNum w:abstractNumId="7" w15:restartNumberingAfterBreak="0">
     <w:nsid w:val="FFFFFF88"/>
     <w:multiLevelType w:val="singleLevel"/>
-    <w:tmpl w:val="DCEE2FFC"/>
+    <w:tmpl w:val="D6B0CD3A"/>
     <w:lvl w:ilvl="0">
       <w:start w:val="1"/>
       <w:numFmt w:val="decimal"/>
@@ -13424,6 +13474,19 @@
       <w:u w:val="single"/>
     </w:rPr>
   </w:style>
+  <w:style w:type="character" w:styleId="CdigoHTML">
+    <w:name w:val="HTML Code"/>
+    <w:basedOn w:val="Fuentedeprrafopredeter"/>
+    <w:uiPriority w:val="99"/>
+    <w:semiHidden/>
+    <w:unhideWhenUsed/>
+    <w:rsid w:val="00EC1C1B"/>
+    <w:rPr>
+      <w:rFonts w:ascii="Courier New" w:eastAsia="Times New Roman" w:hAnsi="Courier New" w:cs="Courier New"/>
+      <w:sz w:val="20"/>
+      <w:szCs w:val="20"/>
+    </w:rPr>
+  </w:style>
 </w:styles>
 </file>
 
@@ -13752,7 +13815,7 @@
 </file>
 
 <file path=customXml/itemProps1.xml><?xml version="1.0" encoding="utf-8"?>
-<ds:datastoreItem xmlns:ds="http://schemas.openxmlformats.org/officeDocument/2006/customXml" ds:itemID="{3834A667-A654-48F3-9EBF-752F8974B988}">
+<ds:datastoreItem xmlns:ds="http://schemas.openxmlformats.org/officeDocument/2006/customXml" ds:itemID="{92ACDFF1-E50D-4110-80C2-E5D5614A0189}">
   <ds:schemaRefs>
     <ds:schemaRef ds:uri="http://schemas.openxmlformats.org/officeDocument/2006/bibliography"/>
   </ds:schemaRefs>

</xml_diff>